<commit_message>
Rebuild Day 2 for shorter report reading sessions
Co-Authored-By: Codex <noreply@openai.com>
</commit_message>
<xml_diff>
--- a/Module_2_Oct_2026_v2/GreenWaste_case_brief.docx
+++ b/Module_2_Oct_2026_v2/GreenWaste_case_brief.docx
@@ -2,6 +2,24 @@
 <file path=word/document.xml><?xml version="1.0" encoding="utf-8"?>
 <w:document xmlns:wpc="http://schemas.microsoft.com/office/word/2010/wordprocessingCanvas" xmlns:cx="http://schemas.microsoft.com/office/drawing/2014/chartex" xmlns:cx1="http://schemas.microsoft.com/office/drawing/2015/9/8/chartex" xmlns:cx2="http://schemas.microsoft.com/office/drawing/2015/10/21/chartex" xmlns:cx3="http://schemas.microsoft.com/office/drawing/2016/5/9/chartex" xmlns:cx4="http://schemas.microsoft.com/office/drawing/2016/5/10/chartex" xmlns:cx5="http://schemas.microsoft.com/office/drawing/2016/5/11/chartex" xmlns:cx6="http://schemas.microsoft.com/office/drawing/2016/5/12/chartex" xmlns:cx7="http://schemas.microsoft.com/office/drawing/2016/5/13/chartex" xmlns:cx8="http://schemas.microsoft.com/office/drawing/2016/5/14/chartex" xmlns:mc="http://schemas.openxmlformats.org/markup-compatibility/2006" xmlns:aink="http://schemas.microsoft.com/office/drawing/2016/ink" xmlns:am3d="http://schemas.microsoft.com/office/drawing/2017/model3d" xmlns:o="urn:schemas-microsoft-com:office:office" xmlns:r="http://schemas.openxmlformats.org/officeDocument/2006/relationships" xmlns:m="http://schemas.openxmlformats.org/officeDocument/2006/math" xmlns:v="urn:schemas-microsoft-com:vml" xmlns:wp14="http://schemas.microsoft.com/office/word/2010/wordprocessingDrawing" xmlns:wp="http://schemas.openxmlformats.org/drawingml/2006/wordprocessingDrawing" xmlns:w10="urn:schemas-microsoft-com:office:word" xmlns:w="http://schemas.openxmlformats.org/wordprocessingml/2006/main" xmlns:w14="http://schemas.microsoft.com/office/word/2010/wordml" xmlns:w15="http://schemas.microsoft.com/office/word/2012/wordml" xmlns:w16cex="http://schemas.microsoft.com/office/word/2018/wordml/cex" xmlns:w16cid="http://schemas.microsoft.com/office/word/2016/wordml/cid" xmlns:w16="http://schemas.microsoft.com/office/word/2018/wordml" xmlns:w16se="http://schemas.microsoft.com/office/word/2015/wordml/symex" xmlns:wpg="http://schemas.microsoft.com/office/word/2010/wordprocessingGroup" xmlns:wpi="http://schemas.microsoft.com/office/word/2010/wordprocessingInk" xmlns:wne="http://schemas.microsoft.com/office/word/2006/wordml" xmlns:wps="http://schemas.microsoft.com/office/word/2010/wordprocessingShape" mc:Ignorable="w14 w15 w16se w16cid w16 w16cex wp14">
   <w:body>
+    <w:p>
+      <w:pPr>
+        <w:pStyle w:val="Title"/>
+      </w:pPr>
+      <w:r>
+        <w:rPr>
+          <w:rFonts w:ascii="Arial" w:hAnsi="Arial" w:eastAsia="Arial" w:cs="Arial"/>
+          <w:i w:val="false"/>
+          <w:b w:val="true"/>
+          <w:u w:val="none"/>
+          <w:strike w:val="false"/>
+          <w:sz w:val="44"/>
+          <w:szCs w:val="44"/>
+          <w:color w:val="000000"/>
+        </w:rPr>
+        <w:t xml:space="preserve">GreenWaste case reference</w:t>
+      </w:r>
+    </w:p>
     <w:p>
       <w:pPr>
         <w:pStyle w:val="Normal"/>
@@ -12,7 +30,34 @@
           <w:left w:val="none" w:sz="0" w:space="0" w:color="000000"/>
           <w:right w:val="none" w:sz="0" w:space="0" w:color="000000"/>
         </w:pBdr>
-        <w:spacing w:after="0" w:before="0" w:line="240"/>
+        <w:spacing w:after="160" w:before="0" w:line="240"/>
+        <w:ind w:left="0" w:right="0" w:firstLine="0" w:firstLineChars="0"/>
+      </w:pPr>
+      <w:r>
+        <w:rPr>
+          <w:rFonts w:ascii="Arial" w:hAnsi="Arial" w:eastAsia="Arial" w:cs="Arial"/>
+          <w:i w:val="false"/>
+          <w:b w:val="false"/>
+          <w:u w:val="none"/>
+          <w:strike w:val="false"/>
+          <w:sz w:val="24"/>
+          <w:szCs w:val="24"/>
+          <w:color w:val="000000"/>
+        </w:rPr>
+        <w:t xml:space="preserve">Use this reference when reading the evaluation extracts. It describes the programme, the compared businesses and the recorded outcomes.</w:t>
+      </w:r>
+    </w:p>
+    <w:p>
+      <w:pPr>
+        <w:pStyle w:val="Normal"/>
+        <w:jc w:val="left"/>
+        <w:pBdr>
+          <w:bottom w:val="none" w:sz="0" w:space="0" w:color="000000"/>
+          <w:top w:val="none" w:sz="0" w:space="0" w:color="000000"/>
+          <w:left w:val="none" w:sz="0" w:space="0" w:color="000000"/>
+          <w:right w:val="none" w:sz="0" w:space="0" w:color="000000"/>
+        </w:pBdr>
+        <w:spacing w:after="160" w:before="0" w:line="240"/>
         <w:ind w:left="0" w:right="0" w:firstLine="0" w:firstLineChars="0"/>
       </w:pPr>
       <w:r>
@@ -26,7 +71,7 @@
           <w:szCs w:val="18"/>
           <w:color w:val="545860"/>
         </w:rPr>
-        <w:t xml:space="preserve">Module 2 · Reading Impact Evaluation Results · the case for the week</w:t>
+        <w:t xml:space="preserve">Fictional GreenWaste case | invented figures</w:t>
       </w:r>
     </w:p>
     <w:p>
@@ -39,7 +84,7 @@
           <w:left w:val="none" w:sz="0" w:space="0" w:color="000000"/>
           <w:right w:val="none" w:sz="0" w:space="0" w:color="000000"/>
         </w:pBdr>
-        <w:spacing w:after="40" w:before="0" w:line="240"/>
+        <w:spacing w:after="120" w:before="0" w:line="240"/>
         <w:ind w:left="0" w:right="0" w:firstLine="0" w:firstLineChars="0"/>
       </w:pPr>
       <w:r>
@@ -49,11 +94,11 @@
           <w:b w:val="true"/>
           <w:u w:val="none"/>
           <w:strike w:val="false"/>
-          <w:sz w:val="40"/>
-          <w:szCs w:val="40"/>
-          <w:color w:val="063360"/>
+          <w:sz w:val="28"/>
+          <w:szCs w:val="28"/>
+          <w:color w:val="000000"/>
         </w:rPr>
-        <w:t xml:space="preserve">The GreenWaste programme</w:t>
+        <w:t xml:space="preserve">The programme and decision</w:t>
       </w:r>
     </w:p>
     <w:p>
@@ -72,15 +117,15 @@
       <w:r>
         <w:rPr>
           <w:rFonts w:ascii="Arial" w:hAnsi="Arial" w:eastAsia="Arial" w:cs="Arial"/>
-          <w:i w:val="true"/>
+          <w:i w:val="false"/>
           <w:b w:val="false"/>
           <w:u w:val="none"/>
           <w:strike w:val="false"/>
-          <w:sz w:val="19"/>
-          <w:szCs w:val="19"/>
-          <w:color w:val="545860"/>
+          <w:sz w:val="24"/>
+          <w:szCs w:val="24"/>
+          <w:color w:val="000000"/>
         </w:rPr>
-        <w:t xml:space="preserve">Invented for this training. Keep this page: every GreenWaste session uses it.</w:t>
+        <w:t xml:space="preserve">GreenWaste provides a subsidy for waste equipment, technical help with installation and staff training. Higher efficiency scores mean more efficient businesses.</w:t>
       </w:r>
     </w:p>
     <w:p>
@@ -93,7 +138,34 @@
           <w:left w:val="none" w:sz="0" w:space="0" w:color="000000"/>
           <w:right w:val="none" w:sz="0" w:space="0" w:color="000000"/>
         </w:pBdr>
-        <w:spacing w:after="60" w:before="0" w:line="240"/>
+        <w:spacing w:after="160" w:before="0" w:line="240"/>
+        <w:ind w:left="0" w:right="0" w:firstLine="0" w:firstLineChars="0"/>
+      </w:pPr>
+      <w:r>
+        <w:rPr>
+          <w:rFonts w:ascii="Arial" w:hAnsi="Arial" w:eastAsia="Arial" w:cs="Arial"/>
+          <w:i w:val="false"/>
+          <w:b w:val="false"/>
+          <w:u w:val="none"/>
+          <w:strike w:val="false"/>
+          <w:sz w:val="24"/>
+          <w:szCs w:val="24"/>
+          <w:color w:val="000000"/>
+        </w:rPr>
+        <w:t xml:space="preserve">Course decision rule: at least 1,000 AED annual saving per business, measured after 12 months. A credible comparison is needed to estimate the saving GreenWaste caused. This rule alone is not a full value-for-money test.</w:t>
+      </w:r>
+    </w:p>
+    <w:p>
+      <w:pPr>
+        <w:pStyle w:val="Normal"/>
+        <w:jc w:val="left"/>
+        <w:pBdr>
+          <w:bottom w:val="none" w:sz="0" w:space="0" w:color="000000"/>
+          <w:top w:val="none" w:sz="0" w:space="0" w:color="000000"/>
+          <w:left w:val="none" w:sz="0" w:space="0" w:color="000000"/>
+          <w:right w:val="none" w:sz="0" w:space="0" w:color="000000"/>
+        </w:pBdr>
+        <w:spacing w:after="120" w:before="0" w:line="240"/>
         <w:ind w:left="0" w:right="0" w:firstLine="0" w:firstLineChars="0"/>
       </w:pPr>
       <w:r>
@@ -103,23 +175,23 @@
           <w:b w:val="true"/>
           <w:u w:val="none"/>
           <w:strike w:val="false"/>
-          <w:sz w:val="25"/>
-          <w:szCs w:val="25"/>
-          <w:color w:val="215A9E"/>
+          <w:sz w:val="28"/>
+          <w:szCs w:val="28"/>
+          <w:color w:val="000000"/>
         </w:rPr>
-        <w:t xml:space="preserve">What it is</w:t>
+        <w:t xml:space="preserve">How businesses joined</w:t>
       </w:r>
     </w:p>
     <w:tbl xmlns:a="http://schemas.openxmlformats.org/drawingml/2006/main" xmlns:pic="http://schemas.openxmlformats.org/drawingml/2006/picture">
       <w:tblPr>
         <w:tblLayout w:type="fixed"/>
-        <w:jc w:val="center"/>
+        <w:jc w:val="start"/>
         <w:tblLook w:firstRow="1" w:lastRow="0" w:firstColumn="0" w:lastColumn="0" w:noHBand="0" w:noVBand="1"/>
       </w:tblPr>
       <w:tblGrid>
-        <w:gridCol w:w="3312"/>
-        <w:gridCol w:w="3312"/>
-        <w:gridCol w:w="3312"/>
+        <w:gridCol w:w="2016"/>
+        <w:gridCol w:w="1728"/>
+        <w:gridCol w:w="5328"/>
       </w:tblGrid>
       <w:tr>
         <w:trPr>
@@ -130,19 +202,19 @@
         <w:tc>
           <w:tcPr>
             <w:tcBorders>
-              <w:bottom w:val="none" w:sz="0" w:space="0" w:color="000000"/>
-              <w:top w:val="single" w:sz="10" w:space="0" w:color="063360"/>
-              <w:left w:val="none" w:sz="0" w:space="0" w:color="000000"/>
-              <w:right w:val="none" w:sz="0" w:space="0" w:color="000000"/>
+              <w:bottom w:val="single" w:sz="6" w:space="0" w:color="D9D9D9"/>
+              <w:top w:val="single" w:sz="6" w:space="0" w:color="D9D9D9"/>
+              <w:left w:val="single" w:sz="6" w:space="0" w:color="D9D9D9"/>
+              <w:right w:val="single" w:sz="6" w:space="0" w:color="D9D9D9"/>
             </w:tcBorders>
-            <w:shd w:val="clear" w:color="auto" w:fill="E3EBF5"/>
+            <w:shd w:val="clear" w:color="auto" w:fill="063360"/>
             <w:tcMar>
               <w:top w:w="0" w:type="dxa"/>
               <w:bottom w:w="0" w:type="dxa"/>
               <w:left w:w="0" w:type="dxa"/>
               <w:right w:w="0" w:type="dxa"/>
             </w:tcMar>
-            <w:vAlign w:val="top"/>
+            <w:vAlign w:val="center"/>
           </w:tcPr>
           <w:p>
             <w:pPr>
@@ -153,17 +225,17 @@
                 <w:left w:val="none" w:sz="0" w:space="0" w:color="000000"/>
                 <w:right w:val="none" w:sz="0" w:space="0" w:color="000000"/>
               </w:pBdr>
-              <w:spacing w:after="80" w:before="80" w:line="240"/>
-              <w:ind w:left="80" w:right="80" w:firstLine="0" w:firstLineChars="0"/>
+              <w:spacing w:after="140" w:before="140" w:line="240"/>
+              <w:ind w:left="140" w:right="140" w:firstLine="0" w:firstLineChars="0"/>
               <w:rPr>
                 <w:rFonts w:ascii="Arial" w:hAnsi="Arial" w:eastAsia="Arial" w:cs="Arial"/>
                 <w:i w:val="false"/>
                 <w:b w:val="true"/>
                 <w:u w:val="none"/>
                 <w:strike w:val="false"/>
-                <w:sz w:val="20"/>
-                <w:szCs w:val="20"/>
-                <w:color w:val="063360"/>
+                <w:sz w:val="24"/>
+                <w:szCs w:val="24"/>
+                <w:color w:val="FFFFFF"/>
               </w:rPr>
             </w:pPr>
             <w:r>
@@ -173,30 +245,30 @@
                 <w:b w:val="true"/>
                 <w:u w:val="none"/>
                 <w:strike w:val="false"/>
-                <w:sz w:val="20"/>
-                <w:szCs w:val="20"/>
-                <w:color w:val="063360"/>
-              </w:rPr>
-              <w:t xml:space="preserve">What it does</w:t>
+                <w:sz w:val="24"/>
+                <w:szCs w:val="24"/>
+                <w:color w:val="FFFFFF"/>
+              </w:rPr>
+              <w:t xml:space="preserve">Setting</w:t>
             </w:r>
           </w:p>
         </w:tc>
         <w:tc>
           <w:tcPr>
             <w:tcBorders>
-              <w:bottom w:val="none" w:sz="0" w:space="0" w:color="000000"/>
-              <w:top w:val="single" w:sz="10" w:space="0" w:color="063360"/>
-              <w:left w:val="none" w:sz="0" w:space="0" w:color="000000"/>
-              <w:right w:val="none" w:sz="0" w:space="0" w:color="000000"/>
+              <w:bottom w:val="single" w:sz="6" w:space="0" w:color="D9D9D9"/>
+              <w:top w:val="single" w:sz="6" w:space="0" w:color="D9D9D9"/>
+              <w:left w:val="single" w:sz="6" w:space="0" w:color="D9D9D9"/>
+              <w:right w:val="single" w:sz="6" w:space="0" w:color="D9D9D9"/>
             </w:tcBorders>
-            <w:shd w:val="clear" w:color="auto" w:fill="E3EBF5"/>
+            <w:shd w:val="clear" w:color="auto" w:fill="063360"/>
             <w:tcMar>
               <w:top w:w="0" w:type="dxa"/>
               <w:bottom w:w="0" w:type="dxa"/>
               <w:left w:w="0" w:type="dxa"/>
               <w:right w:w="0" w:type="dxa"/>
             </w:tcMar>
-            <w:vAlign w:val="top"/>
+            <w:vAlign w:val="center"/>
           </w:tcPr>
           <w:p>
             <w:pPr>
@@ -207,17 +279,17 @@
                 <w:left w:val="none" w:sz="0" w:space="0" w:color="000000"/>
                 <w:right w:val="none" w:sz="0" w:space="0" w:color="000000"/>
               </w:pBdr>
-              <w:spacing w:after="80" w:before="80" w:line="240"/>
-              <w:ind w:left="80" w:right="80" w:firstLine="0" w:firstLineChars="0"/>
+              <w:spacing w:after="140" w:before="140" w:line="240"/>
+              <w:ind w:left="140" w:right="140" w:firstLine="0" w:firstLineChars="0"/>
               <w:rPr>
                 <w:rFonts w:ascii="Arial" w:hAnsi="Arial" w:eastAsia="Arial" w:cs="Arial"/>
                 <w:i w:val="false"/>
                 <w:b w:val="true"/>
                 <w:u w:val="none"/>
                 <w:strike w:val="false"/>
-                <w:sz w:val="20"/>
-                <w:szCs w:val="20"/>
-                <w:color w:val="063360"/>
+                <w:sz w:val="24"/>
+                <w:szCs w:val="24"/>
+                <w:color w:val="FFFFFF"/>
               </w:rPr>
             </w:pPr>
             <w:r>
@@ -227,30 +299,30 @@
                 <w:b w:val="true"/>
                 <w:u w:val="none"/>
                 <w:strike w:val="false"/>
-                <w:sz w:val="20"/>
-                <w:szCs w:val="20"/>
-                <w:color w:val="063360"/>
-              </w:rPr>
-              <w:t xml:space="preserve">Who it is for</w:t>
+                <w:sz w:val="24"/>
+                <w:szCs w:val="24"/>
+                <w:color w:val="FFFFFF"/>
+              </w:rPr>
+              <w:t xml:space="preserve">Businesses</w:t>
             </w:r>
           </w:p>
         </w:tc>
         <w:tc>
           <w:tcPr>
             <w:tcBorders>
-              <w:bottom w:val="none" w:sz="0" w:space="0" w:color="000000"/>
-              <w:top w:val="single" w:sz="10" w:space="0" w:color="063360"/>
-              <w:left w:val="none" w:sz="0" w:space="0" w:color="000000"/>
-              <w:right w:val="none" w:sz="0" w:space="0" w:color="000000"/>
+              <w:bottom w:val="single" w:sz="6" w:space="0" w:color="D9D9D9"/>
+              <w:top w:val="single" w:sz="6" w:space="0" w:color="D9D9D9"/>
+              <w:left w:val="single" w:sz="6" w:space="0" w:color="D9D9D9"/>
+              <w:right w:val="single" w:sz="6" w:space="0" w:color="D9D9D9"/>
             </w:tcBorders>
-            <w:shd w:val="clear" w:color="auto" w:fill="E3EBF5"/>
+            <w:shd w:val="clear" w:color="auto" w:fill="063360"/>
             <w:tcMar>
               <w:top w:w="0" w:type="dxa"/>
               <w:bottom w:w="0" w:type="dxa"/>
               <w:left w:w="0" w:type="dxa"/>
               <w:right w:w="0" w:type="dxa"/>
             </w:tcMar>
-            <w:vAlign w:val="top"/>
+            <w:vAlign w:val="center"/>
           </w:tcPr>
           <w:p>
             <w:pPr>
@@ -261,17 +333,17 @@
                 <w:left w:val="none" w:sz="0" w:space="0" w:color="000000"/>
                 <w:right w:val="none" w:sz="0" w:space="0" w:color="000000"/>
               </w:pBdr>
-              <w:spacing w:after="80" w:before="80" w:line="240"/>
-              <w:ind w:left="80" w:right="80" w:firstLine="0" w:firstLineChars="0"/>
+              <w:spacing w:after="140" w:before="140" w:line="240"/>
+              <w:ind w:left="140" w:right="140" w:firstLine="0" w:firstLineChars="0"/>
               <w:rPr>
                 <w:rFonts w:ascii="Arial" w:hAnsi="Arial" w:eastAsia="Arial" w:cs="Arial"/>
                 <w:i w:val="false"/>
                 <w:b w:val="true"/>
                 <w:u w:val="none"/>
                 <w:strike w:val="false"/>
-                <w:sz w:val="20"/>
-                <w:szCs w:val="20"/>
-                <w:color w:val="B8272C"/>
+                <w:sz w:val="24"/>
+                <w:szCs w:val="24"/>
+                <w:color w:val="FFFFFF"/>
               </w:rPr>
             </w:pPr>
             <w:r>
@@ -281,11 +353,11 @@
                 <w:b w:val="true"/>
                 <w:u w:val="none"/>
                 <w:strike w:val="false"/>
-                <w:sz w:val="20"/>
-                <w:szCs w:val="20"/>
-                <w:color w:val="B8272C"/>
-              </w:rPr>
-              <w:t xml:space="preserve">The decision</w:t>
+                <w:sz w:val="24"/>
+                <w:szCs w:val="24"/>
+                <w:color w:val="FFFFFF"/>
+              </w:rPr>
+              <w:t xml:space="preserve">Selection</w:t>
             </w:r>
           </w:p>
         </w:tc>
@@ -298,10 +370,10 @@
         <w:tc>
           <w:tcPr>
             <w:tcBorders>
-              <w:bottom w:val="single" w:sz="6" w:space="0" w:color="9AA8B8"/>
-              <w:top w:val="none" w:sz="0" w:space="0" w:color="000000"/>
-              <w:left w:val="none" w:sz="0" w:space="0" w:color="000000"/>
-              <w:right w:val="none" w:sz="0" w:space="0" w:color="000000"/>
+              <w:bottom w:val="single" w:sz="6" w:space="0" w:color="D9D9D9"/>
+              <w:top w:val="single" w:sz="6" w:space="0" w:color="D9D9D9"/>
+              <w:left w:val="single" w:sz="6" w:space="0" w:color="D9D9D9"/>
+              <w:right w:val="single" w:sz="6" w:space="0" w:color="D9D9D9"/>
             </w:tcBorders>
             <w:shd w:val="clear" w:color="auto" w:fill="FFFFFF"/>
             <w:tcMar>
@@ -310,7 +382,7 @@
               <w:left w:w="0" w:type="dxa"/>
               <w:right w:w="0" w:type="dxa"/>
             </w:tcMar>
-            <w:vAlign w:val="top"/>
+            <w:vAlign w:val="center"/>
           </w:tcPr>
           <w:p>
             <w:pPr>
@@ -321,16 +393,16 @@
                 <w:left w:val="none" w:sz="0" w:space="0" w:color="000000"/>
                 <w:right w:val="none" w:sz="0" w:space="0" w:color="000000"/>
               </w:pBdr>
-              <w:spacing w:after="80" w:before="80" w:line="240"/>
-              <w:ind w:left="80" w:right="80" w:firstLine="0" w:firstLineChars="0"/>
-              <w:rPr>
-                <w:rFonts w:ascii="Arial" w:hAnsi="Arial" w:eastAsia="Arial" w:cs="Arial"/>
-                <w:i w:val="false"/>
-                <w:b w:val="false"/>
-                <w:u w:val="none"/>
-                <w:strike w:val="false"/>
-                <w:sz w:val="20"/>
-                <w:szCs w:val="20"/>
+              <w:spacing w:after="140" w:before="140" w:line="240"/>
+              <w:ind w:left="140" w:right="140" w:firstLine="0" w:firstLineChars="0"/>
+              <w:rPr>
+                <w:rFonts w:ascii="Arial" w:hAnsi="Arial" w:eastAsia="Arial" w:cs="Arial"/>
+                <w:i w:val="false"/>
+                <w:b w:val="false"/>
+                <w:u w:val="none"/>
+                <w:strike w:val="false"/>
+                <w:sz w:val="24"/>
+                <w:szCs w:val="24"/>
                 <w:color w:val="000000"/>
               </w:rPr>
             </w:pPr>
@@ -341,21 +413,21 @@
                 <w:b w:val="false"/>
                 <w:u w:val="none"/>
                 <w:strike w:val="false"/>
-                <w:sz w:val="20"/>
-                <w:szCs w:val="20"/>
-                <w:color w:val="000000"/>
-              </w:rPr>
-              <w:t xml:space="preserve">A subsidy for new waste equipment, technical help to install it, and training for staff.</w:t>
+                <w:sz w:val="24"/>
+                <w:szCs w:val="24"/>
+                <w:color w:val="000000"/>
+              </w:rPr>
+              <w:t xml:space="preserve">Pilot district</w:t>
             </w:r>
           </w:p>
         </w:tc>
         <w:tc>
           <w:tcPr>
             <w:tcBorders>
-              <w:bottom w:val="single" w:sz="6" w:space="0" w:color="9AA8B8"/>
-              <w:top w:val="none" w:sz="0" w:space="0" w:color="000000"/>
-              <w:left w:val="none" w:sz="0" w:space="0" w:color="000000"/>
-              <w:right w:val="none" w:sz="0" w:space="0" w:color="000000"/>
+              <w:bottom w:val="single" w:sz="6" w:space="0" w:color="D9D9D9"/>
+              <w:top w:val="single" w:sz="6" w:space="0" w:color="D9D9D9"/>
+              <w:left w:val="single" w:sz="6" w:space="0" w:color="D9D9D9"/>
+              <w:right w:val="single" w:sz="6" w:space="0" w:color="D9D9D9"/>
             </w:tcBorders>
             <w:shd w:val="clear" w:color="auto" w:fill="FFFFFF"/>
             <w:tcMar>
@@ -364,7 +436,7 @@
               <w:left w:w="0" w:type="dxa"/>
               <w:right w:w="0" w:type="dxa"/>
             </w:tcMar>
-            <w:vAlign w:val="top"/>
+            <w:vAlign w:val="center"/>
           </w:tcPr>
           <w:p>
             <w:pPr>
@@ -375,16 +447,16 @@
                 <w:left w:val="none" w:sz="0" w:space="0" w:color="000000"/>
                 <w:right w:val="none" w:sz="0" w:space="0" w:color="000000"/>
               </w:pBdr>
-              <w:spacing w:after="80" w:before="80" w:line="240"/>
-              <w:ind w:left="80" w:right="80" w:firstLine="0" w:firstLineChars="0"/>
-              <w:rPr>
-                <w:rFonts w:ascii="Arial" w:hAnsi="Arial" w:eastAsia="Arial" w:cs="Arial"/>
-                <w:i w:val="false"/>
-                <w:b w:val="false"/>
-                <w:u w:val="none"/>
-                <w:strike w:val="false"/>
-                <w:sz w:val="20"/>
-                <w:szCs w:val="20"/>
+              <w:spacing w:after="140" w:before="140" w:line="240"/>
+              <w:ind w:left="140" w:right="140" w:firstLine="0" w:firstLineChars="0"/>
+              <w:rPr>
+                <w:rFonts w:ascii="Arial" w:hAnsi="Arial" w:eastAsia="Arial" w:cs="Arial"/>
+                <w:i w:val="false"/>
+                <w:b w:val="false"/>
+                <w:u w:val="none"/>
+                <w:strike w:val="false"/>
+                <w:sz w:val="24"/>
+                <w:szCs w:val="24"/>
                 <w:color w:val="000000"/>
               </w:rPr>
             </w:pPr>
@@ -395,21 +467,21 @@
                 <w:b w:val="false"/>
                 <w:u w:val="none"/>
                 <w:strike w:val="false"/>
-                <w:sz w:val="20"/>
-                <w:szCs w:val="20"/>
-                <w:color w:val="000000"/>
-              </w:rPr>
-              <w:t xml:space="preserve">Businesses with an efficiency score of 58 or below. Every business has a score from 0 to 100; higher means more efficient.</w:t>
+                <w:sz w:val="24"/>
+                <w:szCs w:val="24"/>
+                <w:color w:val="000000"/>
+              </w:rPr>
+              <w:t xml:space="preserve">400</w:t>
             </w:r>
           </w:p>
         </w:tc>
         <w:tc>
           <w:tcPr>
             <w:tcBorders>
-              <w:bottom w:val="single" w:sz="6" w:space="0" w:color="9AA8B8"/>
-              <w:top w:val="none" w:sz="0" w:space="0" w:color="000000"/>
-              <w:left w:val="none" w:sz="0" w:space="0" w:color="000000"/>
-              <w:right w:val="none" w:sz="0" w:space="0" w:color="000000"/>
+              <w:bottom w:val="single" w:sz="6" w:space="0" w:color="D9D9D9"/>
+              <w:top w:val="single" w:sz="6" w:space="0" w:color="D9D9D9"/>
+              <w:left w:val="single" w:sz="6" w:space="0" w:color="D9D9D9"/>
+              <w:right w:val="single" w:sz="6" w:space="0" w:color="D9D9D9"/>
             </w:tcBorders>
             <w:shd w:val="clear" w:color="auto" w:fill="FFFFFF"/>
             <w:tcMar>
@@ -418,7 +490,7 @@
               <w:left w:w="0" w:type="dxa"/>
               <w:right w:w="0" w:type="dxa"/>
             </w:tcMar>
-            <w:vAlign w:val="top"/>
+            <w:vAlign w:val="center"/>
           </w:tcPr>
           <w:p>
             <w:pPr>
@@ -429,16 +501,16 @@
                 <w:left w:val="none" w:sz="0" w:space="0" w:color="000000"/>
                 <w:right w:val="none" w:sz="0" w:space="0" w:color="000000"/>
               </w:pBdr>
-              <w:spacing w:after="80" w:before="80" w:line="240"/>
-              <w:ind w:left="80" w:right="80" w:firstLine="0" w:firstLineChars="0"/>
-              <w:rPr>
-                <w:rFonts w:ascii="Arial" w:hAnsi="Arial" w:eastAsia="Arial" w:cs="Arial"/>
-                <w:i w:val="false"/>
-                <w:b w:val="false"/>
-                <w:u w:val="none"/>
-                <w:strike w:val="false"/>
-                <w:sz w:val="20"/>
-                <w:szCs w:val="20"/>
+              <w:spacing w:after="140" w:before="140" w:line="240"/>
+              <w:ind w:left="140" w:right="140" w:firstLine="0" w:firstLineChars="0"/>
+              <w:rPr>
+                <w:rFonts w:ascii="Arial" w:hAnsi="Arial" w:eastAsia="Arial" w:cs="Arial"/>
+                <w:i w:val="false"/>
+                <w:b w:val="false"/>
+                <w:u w:val="none"/>
+                <w:strike w:val="false"/>
+                <w:sz w:val="24"/>
+                <w:szCs w:val="24"/>
                 <w:color w:val="000000"/>
               </w:rPr>
             </w:pPr>
@@ -449,11 +521,179 @@
                 <w:b w:val="false"/>
                 <w:u w:val="none"/>
                 <w:strike w:val="false"/>
-                <w:sz w:val="20"/>
-                <w:szCs w:val="20"/>
-                <w:color w:val="000000"/>
-              </w:rPr>
-              <w:t xml:space="preserve">Scale up nationally only if waste costs fall by at least 1,000 AED per business per year.</w:t>
+                <w:sz w:val="24"/>
+                <w:szCs w:val="24"/>
+                <w:color w:val="000000"/>
+              </w:rPr>
+              <w:t xml:space="preserve">Lottery: 200 joined and 200 waited. All score 58 or below.</w:t>
+            </w:r>
+          </w:p>
+        </w:tc>
+      </w:tr>
+      <w:tr>
+        <w:trPr>
+          <w:trHeight w:val="360" w:hRule="auto"/>
+        </w:trPr>
+        body2
+        <w:tc>
+          <w:tcPr>
+            <w:tcBorders>
+              <w:bottom w:val="single" w:sz="6" w:space="0" w:color="D9D9D9"/>
+              <w:top w:val="single" w:sz="6" w:space="0" w:color="D9D9D9"/>
+              <w:left w:val="single" w:sz="6" w:space="0" w:color="D9D9D9"/>
+              <w:right w:val="single" w:sz="6" w:space="0" w:color="D9D9D9"/>
+            </w:tcBorders>
+            <w:shd w:val="clear" w:color="auto" w:fill="F1F5F9"/>
+            <w:tcMar>
+              <w:top w:w="0" w:type="dxa"/>
+              <w:bottom w:w="0" w:type="dxa"/>
+              <w:left w:w="0" w:type="dxa"/>
+              <w:right w:w="0" w:type="dxa"/>
+            </w:tcMar>
+            <w:vAlign w:val="center"/>
+          </w:tcPr>
+          <w:p>
+            <w:pPr>
+              <w:jc w:val="left"/>
+              <w:pBdr>
+                <w:bottom w:val="none" w:sz="0" w:space="0" w:color="000000"/>
+                <w:top w:val="none" w:sz="0" w:space="0" w:color="000000"/>
+                <w:left w:val="none" w:sz="0" w:space="0" w:color="000000"/>
+                <w:right w:val="none" w:sz="0" w:space="0" w:color="000000"/>
+              </w:pBdr>
+              <w:spacing w:after="140" w:before="140" w:line="240"/>
+              <w:ind w:left="140" w:right="140" w:firstLine="0" w:firstLineChars="0"/>
+              <w:rPr>
+                <w:rFonts w:ascii="Arial" w:hAnsi="Arial" w:eastAsia="Arial" w:cs="Arial"/>
+                <w:i w:val="false"/>
+                <w:b w:val="false"/>
+                <w:u w:val="none"/>
+                <w:strike w:val="false"/>
+                <w:sz w:val="24"/>
+                <w:szCs w:val="24"/>
+                <w:color w:val="000000"/>
+              </w:rPr>
+            </w:pPr>
+            <w:r>
+              <w:rPr>
+                <w:rFonts w:ascii="Arial" w:hAnsi="Arial" w:eastAsia="Arial" w:cs="Arial"/>
+                <w:i w:val="false"/>
+                <w:b w:val="false"/>
+                <w:u w:val="none"/>
+                <w:strike w:val="false"/>
+                <w:sz w:val="24"/>
+                <w:szCs w:val="24"/>
+                <w:color w:val="000000"/>
+              </w:rPr>
+              <w:t xml:space="preserve">Rest of city</w:t>
+            </w:r>
+          </w:p>
+        </w:tc>
+        <w:tc>
+          <w:tcPr>
+            <w:tcBorders>
+              <w:bottom w:val="single" w:sz="6" w:space="0" w:color="D9D9D9"/>
+              <w:top w:val="single" w:sz="6" w:space="0" w:color="D9D9D9"/>
+              <w:left w:val="single" w:sz="6" w:space="0" w:color="D9D9D9"/>
+              <w:right w:val="single" w:sz="6" w:space="0" w:color="D9D9D9"/>
+            </w:tcBorders>
+            <w:shd w:val="clear" w:color="auto" w:fill="F1F5F9"/>
+            <w:tcMar>
+              <w:top w:w="0" w:type="dxa"/>
+              <w:bottom w:w="0" w:type="dxa"/>
+              <w:left w:w="0" w:type="dxa"/>
+              <w:right w:w="0" w:type="dxa"/>
+            </w:tcMar>
+            <w:vAlign w:val="center"/>
+          </w:tcPr>
+          <w:p>
+            <w:pPr>
+              <w:jc w:val="left"/>
+              <w:pBdr>
+                <w:bottom w:val="none" w:sz="0" w:space="0" w:color="000000"/>
+                <w:top w:val="none" w:sz="0" w:space="0" w:color="000000"/>
+                <w:left w:val="none" w:sz="0" w:space="0" w:color="000000"/>
+                <w:right w:val="none" w:sz="0" w:space="0" w:color="000000"/>
+              </w:pBdr>
+              <w:spacing w:after="140" w:before="140" w:line="240"/>
+              <w:ind w:left="140" w:right="140" w:firstLine="0" w:firstLineChars="0"/>
+              <w:rPr>
+                <w:rFonts w:ascii="Arial" w:hAnsi="Arial" w:eastAsia="Arial" w:cs="Arial"/>
+                <w:i w:val="false"/>
+                <w:b w:val="false"/>
+                <w:u w:val="none"/>
+                <w:strike w:val="false"/>
+                <w:sz w:val="24"/>
+                <w:szCs w:val="24"/>
+                <w:color w:val="000000"/>
+              </w:rPr>
+            </w:pPr>
+            <w:r>
+              <w:rPr>
+                <w:rFonts w:ascii="Arial" w:hAnsi="Arial" w:eastAsia="Arial" w:cs="Arial"/>
+                <w:i w:val="false"/>
+                <w:b w:val="false"/>
+                <w:u w:val="none"/>
+                <w:strike w:val="false"/>
+                <w:sz w:val="24"/>
+                <w:szCs w:val="24"/>
+                <w:color w:val="000000"/>
+              </w:rPr>
+              <w:t xml:space="preserve">10,000</w:t>
+            </w:r>
+          </w:p>
+        </w:tc>
+        <w:tc>
+          <w:tcPr>
+            <w:tcBorders>
+              <w:bottom w:val="single" w:sz="6" w:space="0" w:color="D9D9D9"/>
+              <w:top w:val="single" w:sz="6" w:space="0" w:color="D9D9D9"/>
+              <w:left w:val="single" w:sz="6" w:space="0" w:color="D9D9D9"/>
+              <w:right w:val="single" w:sz="6" w:space="0" w:color="D9D9D9"/>
+            </w:tcBorders>
+            <w:shd w:val="clear" w:color="auto" w:fill="F1F5F9"/>
+            <w:tcMar>
+              <w:top w:w="0" w:type="dxa"/>
+              <w:bottom w:w="0" w:type="dxa"/>
+              <w:left w:w="0" w:type="dxa"/>
+              <w:right w:w="0" w:type="dxa"/>
+            </w:tcMar>
+            <w:vAlign w:val="center"/>
+          </w:tcPr>
+          <w:p>
+            <w:pPr>
+              <w:jc w:val="left"/>
+              <w:pBdr>
+                <w:bottom w:val="none" w:sz="0" w:space="0" w:color="000000"/>
+                <w:top w:val="none" w:sz="0" w:space="0" w:color="000000"/>
+                <w:left w:val="none" w:sz="0" w:space="0" w:color="000000"/>
+                <w:right w:val="none" w:sz="0" w:space="0" w:color="000000"/>
+              </w:pBdr>
+              <w:spacing w:after="140" w:before="140" w:line="240"/>
+              <w:ind w:left="140" w:right="140" w:firstLine="0" w:firstLineChars="0"/>
+              <w:rPr>
+                <w:rFonts w:ascii="Arial" w:hAnsi="Arial" w:eastAsia="Arial" w:cs="Arial"/>
+                <w:i w:val="false"/>
+                <w:b w:val="false"/>
+                <w:u w:val="none"/>
+                <w:strike w:val="false"/>
+                <w:sz w:val="24"/>
+                <w:szCs w:val="24"/>
+                <w:color w:val="000000"/>
+              </w:rPr>
+            </w:pPr>
+            <w:r>
+              <w:rPr>
+                <w:rFonts w:ascii="Arial" w:hAnsi="Arial" w:eastAsia="Arial" w:cs="Arial"/>
+                <w:i w:val="false"/>
+                <w:b w:val="false"/>
+                <w:u w:val="none"/>
+                <w:strike w:val="false"/>
+                <w:sz w:val="24"/>
+                <w:szCs w:val="24"/>
+                <w:color w:val="000000"/>
+              </w:rPr>
+              <w:t xml:space="preserve">Score rule: 58 or below joined (4,794); above 58 did not (5,206).</w:t>
             </w:r>
           </w:p>
         </w:tc>
@@ -469,21 +709,21 @@
           <w:left w:val="none" w:sz="0" w:space="0" w:color="000000"/>
           <w:right w:val="none" w:sz="0" w:space="0" w:color="000000"/>
         </w:pBdr>
-        <w:spacing w:after="80" w:before="0" w:line="240"/>
+        <w:spacing w:after="120" w:before="0" w:line="240"/>
         <w:ind w:left="0" w:right="0" w:firstLine="0" w:firstLineChars="0"/>
       </w:pPr>
       <w:r>
         <w:rPr>
           <w:rFonts w:ascii="Arial" w:hAnsi="Arial" w:eastAsia="Arial" w:cs="Arial"/>
           <w:i w:val="false"/>
-          <w:b w:val="false"/>
+          <w:b w:val="true"/>
           <w:u w:val="none"/>
           <w:strike w:val="false"/>
-          <w:sz w:val="21"/>
-          <w:szCs w:val="21"/>
+          <w:sz w:val="28"/>
+          <w:szCs w:val="28"/>
           <w:color w:val="000000"/>
         </w:rPr>
-        <w:t xml:space="preserve"/>
+        <w:t xml:space="preserve">What was measured</w:t>
       </w:r>
     </w:p>
     <w:p>
@@ -496,7 +736,34 @@
           <w:left w:val="none" w:sz="0" w:space="0" w:color="000000"/>
           <w:right w:val="none" w:sz="0" w:space="0" w:color="000000"/>
         </w:pBdr>
-        <w:spacing w:after="60" w:before="0" w:line="240"/>
+        <w:spacing w:after="160" w:before="0" w:line="240"/>
+        <w:ind w:left="0" w:right="0" w:firstLine="0" w:firstLineChars="0"/>
+      </w:pPr>
+      <w:r>
+        <w:rPr>
+          <w:rFonts w:ascii="Arial" w:hAnsi="Arial" w:eastAsia="Arial" w:cs="Arial"/>
+          <w:i w:val="false"/>
+          <w:b w:val="false"/>
+          <w:u w:val="none"/>
+          <w:strike w:val="false"/>
+          <w:sz w:val="24"/>
+          <w:szCs w:val="24"/>
+          <w:color w:val="000000"/>
+        </w:rPr>
+        <w:t xml:space="preserve">One row per business. Annual waste cost in AED and annual landfill waste in tonnes, measured before and 12 months after. Manager age, staff, premises area and existing filtration were recorded before the programme.</w:t>
+      </w:r>
+    </w:p>
+    <w:p>
+      <w:pPr>
+        <w:pStyle w:val="Normal"/>
+        <w:jc w:val="left"/>
+        <w:pBdr>
+          <w:bottom w:val="none" w:sz="0" w:space="0" w:color="000000"/>
+          <w:top w:val="none" w:sz="0" w:space="0" w:color="000000"/>
+          <w:left w:val="none" w:sz="0" w:space="0" w:color="000000"/>
+          <w:right w:val="none" w:sz="0" w:space="0" w:color="000000"/>
+        </w:pBdr>
+        <w:spacing w:after="120" w:before="0" w:line="240"/>
         <w:ind w:left="0" w:right="0" w:firstLine="0" w:firstLineChars="0"/>
       </w:pPr>
       <w:r>
@@ -506,24 +773,129 @@
           <w:b w:val="true"/>
           <w:u w:val="none"/>
           <w:strike w:val="false"/>
-          <w:sz w:val="25"/>
-          <w:szCs w:val="25"/>
-          <w:color w:val="215A9E"/>
+          <w:sz w:val="28"/>
+          <w:szCs w:val="28"/>
+          <w:color w:val="000000"/>
         </w:rPr>
-        <w:t xml:space="preserve">How it reached businesses</w:t>
+        <w:t xml:space="preserve">Read the comparison carefully</w:t>
+      </w:r>
+    </w:p>
+    <w:p>
+      <w:pPr>
+        <w:pStyle w:val="Normal"/>
+        <w:jc w:val="left"/>
+        <w:pBdr>
+          <w:bottom w:val="none" w:sz="0" w:space="0" w:color="000000"/>
+          <w:top w:val="none" w:sz="0" w:space="0" w:color="000000"/>
+          <w:left w:val="none" w:sz="0" w:space="0" w:color="000000"/>
+          <w:right w:val="none" w:sz="0" w:space="0" w:color="000000"/>
+        </w:pBdr>
+        <w:spacing w:after="160" w:before="0" w:line="240"/>
+        <w:ind w:left="0" w:right="0" w:firstLine="0" w:firstLineChars="0"/>
+      </w:pPr>
+      <w:r>
+        <w:rPr>
+          <w:rFonts w:ascii="Arial" w:hAnsi="Arial" w:eastAsia="Arial" w:cs="Arial"/>
+          <w:i w:val="false"/>
+          <w:b w:val="false"/>
+          <w:u w:val="none"/>
+          <w:strike w:val="false"/>
+          <w:sz w:val="24"/>
+          <w:szCs w:val="24"/>
+          <w:color w:val="000000"/>
+        </w:rPr>
+        <w:t xml:space="preserve">Each method constructs a different comparison. Ask which businesses it describes, what assumption supports a causal interpretation, how uncertain the result is and what evidence is missing.</w:t>
+      </w:r>
+    </w:p>
+    <w:p>
+      <w:pPr>
+        <w:pStyle w:val="Normal"/>
+        <w:jc w:val="left"/>
+        <w:pBdr>
+          <w:bottom w:val="none" w:sz="0" w:space="0" w:color="000000"/>
+          <w:top w:val="none" w:sz="0" w:space="0" w:color="000000"/>
+          <w:left w:val="none" w:sz="0" w:space="0" w:color="000000"/>
+          <w:right w:val="none" w:sz="0" w:space="0" w:color="000000"/>
+        </w:pBdr>
+        <w:spacing w:after="160" w:before="0" w:line="240"/>
+        <w:ind w:left="0" w:right="0" w:firstLine="0" w:firstLineChars="0"/>
+      </w:pPr>
+      <w:r>
+        <w:rPr>
+          <w:rFonts w:ascii="Arial" w:hAnsi="Arial" w:eastAsia="Arial" w:cs="Arial"/>
+          <w:i w:val="false"/>
+          <w:b w:val="false"/>
+          <w:u w:val="none"/>
+          <w:strike w:val="false"/>
+          <w:sz w:val="22"/>
+          <w:szCs w:val="22"/>
+          <w:color w:val="000000"/>
+        </w:rPr>
+        <w:t xml:space="preserve">Use the picture card when first introducing the case. This cost reference is optional once cost reading has begun.</w:t>
+      </w:r>
+    </w:p>
+    <w:p>
+      <w:pPr/>
+      <w:r>
+        <w:br w:type="page"/>
+      </w:r>
+    </w:p>
+    <w:p>
+      <w:pPr>
+        <w:pStyle w:val="Title"/>
+      </w:pPr>
+      <w:r>
+        <w:rPr>
+          <w:rFonts w:ascii="Arial" w:hAnsi="Arial" w:eastAsia="Arial" w:cs="Arial"/>
+          <w:i w:val="false"/>
+          <w:b w:val="true"/>
+          <w:u w:val="none"/>
+          <w:strike w:val="false"/>
+          <w:sz w:val="44"/>
+          <w:szCs w:val="44"/>
+          <w:color w:val="000000"/>
+        </w:rPr>
+        <w:t xml:space="preserve">Recorded costs and column meanings</w:t>
+      </w:r>
+    </w:p>
+    <w:p>
+      <w:pPr>
+        <w:pStyle w:val="Normal"/>
+        <w:jc w:val="left"/>
+        <w:pBdr>
+          <w:bottom w:val="none" w:sz="0" w:space="0" w:color="000000"/>
+          <w:top w:val="none" w:sz="0" w:space="0" w:color="000000"/>
+          <w:left w:val="none" w:sz="0" w:space="0" w:color="000000"/>
+          <w:right w:val="none" w:sz="0" w:space="0" w:color="000000"/>
+        </w:pBdr>
+        <w:spacing w:after="120" w:before="0" w:line="240"/>
+        <w:ind w:left="0" w:right="0" w:firstLine="0" w:firstLineChars="0"/>
+      </w:pPr>
+      <w:r>
+        <w:rPr>
+          <w:rFonts w:ascii="Arial" w:hAnsi="Arial" w:eastAsia="Arial" w:cs="Arial"/>
+          <w:i w:val="false"/>
+          <w:b w:val="true"/>
+          <w:u w:val="none"/>
+          <w:strike w:val="false"/>
+          <w:sz w:val="28"/>
+          <w:szCs w:val="28"/>
+          <w:color w:val="000000"/>
+        </w:rPr>
+        <w:t xml:space="preserve">Mean annual waste cost in AED</w:t>
       </w:r>
     </w:p>
     <w:tbl xmlns:a="http://schemas.openxmlformats.org/drawingml/2006/main" xmlns:pic="http://schemas.openxmlformats.org/drawingml/2006/picture">
       <w:tblPr>
         <w:tblLayout w:type="fixed"/>
-        <w:jc w:val="center"/>
+        <w:jc w:val="start"/>
         <w:tblLook w:firstRow="1" w:lastRow="0" w:firstColumn="0" w:lastColumn="0" w:noHBand="0" w:noVBand="1"/>
       </w:tblPr>
       <w:tblGrid>
+        <w:gridCol w:w="3600"/>
+        <w:gridCol w:w="1728"/>
         <w:gridCol w:w="1872"/>
-        <w:gridCol w:w="2304"/>
-        <w:gridCol w:w="3744"/>
-        <w:gridCol w:w="2160"/>
+        <w:gridCol w:w="1872"/>
       </w:tblGrid>
       <w:tr>
         <w:trPr>
@@ -534,19 +906,19 @@
         <w:tc>
           <w:tcPr>
             <w:tcBorders>
-              <w:bottom w:val="none" w:sz="0" w:space="0" w:color="000000"/>
-              <w:top w:val="single" w:sz="10" w:space="0" w:color="063360"/>
-              <w:left w:val="none" w:sz="0" w:space="0" w:color="000000"/>
-              <w:right w:val="none" w:sz="0" w:space="0" w:color="000000"/>
+              <w:bottom w:val="single" w:sz="6" w:space="0" w:color="D9D9D9"/>
+              <w:top w:val="single" w:sz="6" w:space="0" w:color="D9D9D9"/>
+              <w:left w:val="single" w:sz="6" w:space="0" w:color="D9D9D9"/>
+              <w:right w:val="single" w:sz="6" w:space="0" w:color="D9D9D9"/>
             </w:tcBorders>
-            <w:shd w:val="clear" w:color="auto" w:fill="E3EBF5"/>
+            <w:shd w:val="clear" w:color="auto" w:fill="063360"/>
             <w:tcMar>
               <w:top w:w="0" w:type="dxa"/>
               <w:bottom w:w="0" w:type="dxa"/>
               <w:left w:w="0" w:type="dxa"/>
               <w:right w:w="0" w:type="dxa"/>
             </w:tcMar>
-            <w:vAlign w:val="top"/>
+            <w:vAlign w:val="center"/>
           </w:tcPr>
           <w:p>
             <w:pPr>
@@ -557,17 +929,17 @@
                 <w:left w:val="none" w:sz="0" w:space="0" w:color="000000"/>
                 <w:right w:val="none" w:sz="0" w:space="0" w:color="000000"/>
               </w:pBdr>
-              <w:spacing w:after="80" w:before="80" w:line="240"/>
-              <w:ind w:left="80" w:right="80" w:firstLine="0" w:firstLineChars="0"/>
+              <w:spacing w:after="140" w:before="140" w:line="240"/>
+              <w:ind w:left="140" w:right="140" w:firstLine="0" w:firstLineChars="0"/>
               <w:rPr>
                 <w:rFonts w:ascii="Arial" w:hAnsi="Arial" w:eastAsia="Arial" w:cs="Arial"/>
                 <w:i w:val="false"/>
                 <w:b w:val="true"/>
                 <w:u w:val="none"/>
                 <w:strike w:val="false"/>
-                <w:sz w:val="20"/>
-                <w:szCs w:val="20"/>
-                <w:color w:val="063360"/>
+                <w:sz w:val="24"/>
+                <w:szCs w:val="24"/>
+                <w:color w:val="FFFFFF"/>
               </w:rPr>
             </w:pPr>
             <w:r>
@@ -577,30 +949,30 @@
                 <w:b w:val="true"/>
                 <w:u w:val="none"/>
                 <w:strike w:val="false"/>
-                <w:sz w:val="20"/>
-                <w:szCs w:val="20"/>
-                <w:color w:val="063360"/>
-              </w:rPr>
-              <w:t xml:space="preserve"> </w:t>
+                <w:sz w:val="24"/>
+                <w:szCs w:val="24"/>
+                <w:color w:val="FFFFFF"/>
+              </w:rPr>
+              <w:t xml:space="preserve">Group</w:t>
             </w:r>
           </w:p>
         </w:tc>
         <w:tc>
           <w:tcPr>
             <w:tcBorders>
-              <w:bottom w:val="none" w:sz="0" w:space="0" w:color="000000"/>
-              <w:top w:val="single" w:sz="10" w:space="0" w:color="063360"/>
-              <w:left w:val="none" w:sz="0" w:space="0" w:color="000000"/>
-              <w:right w:val="none" w:sz="0" w:space="0" w:color="000000"/>
+              <w:bottom w:val="single" w:sz="6" w:space="0" w:color="D9D9D9"/>
+              <w:top w:val="single" w:sz="6" w:space="0" w:color="D9D9D9"/>
+              <w:left w:val="single" w:sz="6" w:space="0" w:color="D9D9D9"/>
+              <w:right w:val="single" w:sz="6" w:space="0" w:color="D9D9D9"/>
             </w:tcBorders>
-            <w:shd w:val="clear" w:color="auto" w:fill="E3EBF5"/>
+            <w:shd w:val="clear" w:color="auto" w:fill="063360"/>
             <w:tcMar>
               <w:top w:w="0" w:type="dxa"/>
               <w:bottom w:w="0" w:type="dxa"/>
               <w:left w:w="0" w:type="dxa"/>
               <w:right w:w="0" w:type="dxa"/>
             </w:tcMar>
-            <w:vAlign w:val="top"/>
+            <w:vAlign w:val="center"/>
           </w:tcPr>
           <w:p>
             <w:pPr>
@@ -611,17 +983,17 @@
                 <w:left w:val="none" w:sz="0" w:space="0" w:color="000000"/>
                 <w:right w:val="none" w:sz="0" w:space="0" w:color="000000"/>
               </w:pBdr>
-              <w:spacing w:after="80" w:before="80" w:line="240"/>
-              <w:ind w:left="80" w:right="80" w:firstLine="0" w:firstLineChars="0"/>
+              <w:spacing w:after="140" w:before="140" w:line="240"/>
+              <w:ind w:left="140" w:right="140" w:firstLine="0" w:firstLineChars="0"/>
               <w:rPr>
                 <w:rFonts w:ascii="Arial" w:hAnsi="Arial" w:eastAsia="Arial" w:cs="Arial"/>
                 <w:i w:val="false"/>
                 <w:b w:val="true"/>
                 <w:u w:val="none"/>
                 <w:strike w:val="false"/>
-                <w:sz w:val="20"/>
-                <w:szCs w:val="20"/>
-                <w:color w:val="063360"/>
+                <w:sz w:val="24"/>
+                <w:szCs w:val="24"/>
+                <w:color w:val="FFFFFF"/>
               </w:rPr>
             </w:pPr>
             <w:r>
@@ -631,9 +1003,9 @@
                 <w:b w:val="true"/>
                 <w:u w:val="none"/>
                 <w:strike w:val="false"/>
-                <w:sz w:val="20"/>
-                <w:szCs w:val="20"/>
-                <w:color w:val="063360"/>
+                <w:sz w:val="24"/>
+                <w:szCs w:val="24"/>
+                <w:color w:val="FFFFFF"/>
               </w:rPr>
               <w:t xml:space="preserve">Businesses</w:t>
             </w:r>
@@ -642,19 +1014,19 @@
         <w:tc>
           <w:tcPr>
             <w:tcBorders>
-              <w:bottom w:val="none" w:sz="0" w:space="0" w:color="000000"/>
-              <w:top w:val="single" w:sz="10" w:space="0" w:color="063360"/>
-              <w:left w:val="none" w:sz="0" w:space="0" w:color="000000"/>
-              <w:right w:val="none" w:sz="0" w:space="0" w:color="000000"/>
+              <w:bottom w:val="single" w:sz="6" w:space="0" w:color="D9D9D9"/>
+              <w:top w:val="single" w:sz="6" w:space="0" w:color="D9D9D9"/>
+              <w:left w:val="single" w:sz="6" w:space="0" w:color="D9D9D9"/>
+              <w:right w:val="single" w:sz="6" w:space="0" w:color="D9D9D9"/>
             </w:tcBorders>
-            <w:shd w:val="clear" w:color="auto" w:fill="E3EBF5"/>
+            <w:shd w:val="clear" w:color="auto" w:fill="063360"/>
             <w:tcMar>
               <w:top w:w="0" w:type="dxa"/>
               <w:bottom w:w="0" w:type="dxa"/>
               <w:left w:w="0" w:type="dxa"/>
               <w:right w:w="0" w:type="dxa"/>
             </w:tcMar>
-            <w:vAlign w:val="top"/>
+            <w:vAlign w:val="center"/>
           </w:tcPr>
           <w:p>
             <w:pPr>
@@ -665,17 +1037,17 @@
                 <w:left w:val="none" w:sz="0" w:space="0" w:color="000000"/>
                 <w:right w:val="none" w:sz="0" w:space="0" w:color="000000"/>
               </w:pBdr>
-              <w:spacing w:after="80" w:before="80" w:line="240"/>
-              <w:ind w:left="80" w:right="80" w:firstLine="0" w:firstLineChars="0"/>
+              <w:spacing w:after="140" w:before="140" w:line="240"/>
+              <w:ind w:left="140" w:right="140" w:firstLine="0" w:firstLineChars="0"/>
               <w:rPr>
                 <w:rFonts w:ascii="Arial" w:hAnsi="Arial" w:eastAsia="Arial" w:cs="Arial"/>
                 <w:i w:val="false"/>
                 <w:b w:val="true"/>
                 <w:u w:val="none"/>
                 <w:strike w:val="false"/>
-                <w:sz w:val="20"/>
-                <w:szCs w:val="20"/>
-                <w:color w:val="063360"/>
+                <w:sz w:val="24"/>
+                <w:szCs w:val="24"/>
+                <w:color w:val="FFFFFF"/>
               </w:rPr>
             </w:pPr>
             <w:r>
@@ -685,30 +1057,30 @@
                 <w:b w:val="true"/>
                 <w:u w:val="none"/>
                 <w:strike w:val="false"/>
-                <w:sz w:val="20"/>
-                <w:szCs w:val="20"/>
-                <w:color w:val="063360"/>
-              </w:rPr>
-              <w:t xml:space="preserve">Who took part</w:t>
+                <w:sz w:val="24"/>
+                <w:szCs w:val="24"/>
+                <w:color w:val="FFFFFF"/>
+              </w:rPr>
+              <w:t xml:space="preserve">Before</w:t>
             </w:r>
           </w:p>
         </w:tc>
         <w:tc>
           <w:tcPr>
             <w:tcBorders>
-              <w:bottom w:val="none" w:sz="0" w:space="0" w:color="000000"/>
-              <w:top w:val="single" w:sz="10" w:space="0" w:color="063360"/>
-              <w:left w:val="none" w:sz="0" w:space="0" w:color="000000"/>
-              <w:right w:val="none" w:sz="0" w:space="0" w:color="000000"/>
+              <w:bottom w:val="single" w:sz="6" w:space="0" w:color="D9D9D9"/>
+              <w:top w:val="single" w:sz="6" w:space="0" w:color="D9D9D9"/>
+              <w:left w:val="single" w:sz="6" w:space="0" w:color="D9D9D9"/>
+              <w:right w:val="single" w:sz="6" w:space="0" w:color="D9D9D9"/>
             </w:tcBorders>
-            <w:shd w:val="clear" w:color="auto" w:fill="E3EBF5"/>
+            <w:shd w:val="clear" w:color="auto" w:fill="063360"/>
             <w:tcMar>
               <w:top w:w="0" w:type="dxa"/>
               <w:bottom w:w="0" w:type="dxa"/>
               <w:left w:w="0" w:type="dxa"/>
               <w:right w:w="0" w:type="dxa"/>
             </w:tcMar>
-            <w:vAlign w:val="top"/>
+            <w:vAlign w:val="center"/>
           </w:tcPr>
           <w:p>
             <w:pPr>
@@ -719,17 +1091,17 @@
                 <w:left w:val="none" w:sz="0" w:space="0" w:color="000000"/>
                 <w:right w:val="none" w:sz="0" w:space="0" w:color="000000"/>
               </w:pBdr>
-              <w:spacing w:after="80" w:before="80" w:line="240"/>
-              <w:ind w:left="80" w:right="80" w:firstLine="0" w:firstLineChars="0"/>
+              <w:spacing w:after="140" w:before="140" w:line="240"/>
+              <w:ind w:left="140" w:right="140" w:firstLine="0" w:firstLineChars="0"/>
               <w:rPr>
                 <w:rFonts w:ascii="Arial" w:hAnsi="Arial" w:eastAsia="Arial" w:cs="Arial"/>
                 <w:i w:val="false"/>
                 <w:b w:val="true"/>
                 <w:u w:val="none"/>
                 <w:strike w:val="false"/>
-                <w:sz w:val="20"/>
-                <w:szCs w:val="20"/>
-                <w:color w:val="063360"/>
+                <w:sz w:val="24"/>
+                <w:szCs w:val="24"/>
+                <w:color w:val="FFFFFF"/>
               </w:rPr>
             </w:pPr>
             <w:r>
@@ -739,11 +1111,11 @@
                 <w:b w:val="true"/>
                 <w:u w:val="none"/>
                 <w:strike w:val="false"/>
-                <w:sz w:val="20"/>
-                <w:szCs w:val="20"/>
-                <w:color w:val="063360"/>
-              </w:rPr>
-              <w:t xml:space="preserve">Measured</w:t>
+                <w:sz w:val="24"/>
+                <w:szCs w:val="24"/>
+                <w:color w:val="FFFFFF"/>
+              </w:rPr>
+              <w:t xml:space="preserve">After</w:t>
             </w:r>
           </w:p>
         </w:tc>
@@ -756,10 +1128,10 @@
         <w:tc>
           <w:tcPr>
             <w:tcBorders>
-              <w:bottom w:val="single" w:sz="6" w:space="0" w:color="9AA8B8"/>
-              <w:top w:val="none" w:sz="0" w:space="0" w:color="000000"/>
-              <w:left w:val="none" w:sz="0" w:space="0" w:color="000000"/>
-              <w:right w:val="none" w:sz="0" w:space="0" w:color="000000"/>
+              <w:bottom w:val="single" w:sz="6" w:space="0" w:color="D9D9D9"/>
+              <w:top w:val="single" w:sz="6" w:space="0" w:color="D9D9D9"/>
+              <w:left w:val="single" w:sz="6" w:space="0" w:color="D9D9D9"/>
+              <w:right w:val="single" w:sz="6" w:space="0" w:color="D9D9D9"/>
             </w:tcBorders>
             <w:shd w:val="clear" w:color="auto" w:fill="FFFFFF"/>
             <w:tcMar>
@@ -768,7 +1140,7 @@
               <w:left w:w="0" w:type="dxa"/>
               <w:right w:w="0" w:type="dxa"/>
             </w:tcMar>
-            <w:vAlign w:val="top"/>
+            <w:vAlign w:val="center"/>
           </w:tcPr>
           <w:p>
             <w:pPr>
@@ -779,41 +1151,41 @@
                 <w:left w:val="none" w:sz="0" w:space="0" w:color="000000"/>
                 <w:right w:val="none" w:sz="0" w:space="0" w:color="000000"/>
               </w:pBdr>
-              <w:spacing w:after="80" w:before="80" w:line="240"/>
-              <w:ind w:left="80" w:right="80" w:firstLine="0" w:firstLineChars="0"/>
-              <w:rPr>
-                <w:rFonts w:ascii="Arial" w:hAnsi="Arial" w:eastAsia="Arial" w:cs="Arial"/>
-                <w:i w:val="false"/>
-                <w:b w:val="true"/>
-                <w:u w:val="none"/>
-                <w:strike w:val="false"/>
-                <w:sz w:val="20"/>
-                <w:szCs w:val="20"/>
-                <w:color w:val="063360"/>
+              <w:spacing w:after="140" w:before="140" w:line="240"/>
+              <w:ind w:left="140" w:right="140" w:firstLine="0" w:firstLineChars="0"/>
+              <w:rPr>
+                <w:rFonts w:ascii="Arial" w:hAnsi="Arial" w:eastAsia="Arial" w:cs="Arial"/>
+                <w:i w:val="false"/>
+                <w:b w:val="false"/>
+                <w:u w:val="none"/>
+                <w:strike w:val="false"/>
+                <w:sz w:val="24"/>
+                <w:szCs w:val="24"/>
+                <w:color w:val="000000"/>
               </w:rPr>
             </w:pPr>
             <w:r>
               <w:rPr>
                 <w:rFonts w:ascii="Arial" w:hAnsi="Arial" w:eastAsia="Arial" w:cs="Arial"/>
                 <w:i w:val="false"/>
-                <w:b w:val="true"/>
-                <w:u w:val="none"/>
-                <w:strike w:val="false"/>
-                <w:sz w:val="20"/>
-                <w:szCs w:val="20"/>
-                <w:color w:val="063360"/>
-              </w:rPr>
-              <w:t xml:space="preserve">Pilot district</w:t>
+                <w:b w:val="false"/>
+                <w:u w:val="none"/>
+                <w:strike w:val="false"/>
+                <w:sz w:val="24"/>
+                <w:szCs w:val="24"/>
+                <w:color w:val="000000"/>
+              </w:rPr>
+              <w:t xml:space="preserve">Pilot joined</w:t>
             </w:r>
           </w:p>
         </w:tc>
         <w:tc>
           <w:tcPr>
             <w:tcBorders>
-              <w:bottom w:val="single" w:sz="6" w:space="0" w:color="9AA8B8"/>
-              <w:top w:val="none" w:sz="0" w:space="0" w:color="000000"/>
-              <w:left w:val="none" w:sz="0" w:space="0" w:color="000000"/>
-              <w:right w:val="none" w:sz="0" w:space="0" w:color="000000"/>
+              <w:bottom w:val="single" w:sz="6" w:space="0" w:color="D9D9D9"/>
+              <w:top w:val="single" w:sz="6" w:space="0" w:color="D9D9D9"/>
+              <w:left w:val="single" w:sz="6" w:space="0" w:color="D9D9D9"/>
+              <w:right w:val="single" w:sz="6" w:space="0" w:color="D9D9D9"/>
             </w:tcBorders>
             <w:shd w:val="clear" w:color="auto" w:fill="FFFFFF"/>
             <w:tcMar>
@@ -822,7 +1194,7 @@
               <w:left w:w="0" w:type="dxa"/>
               <w:right w:w="0" w:type="dxa"/>
             </w:tcMar>
-            <w:vAlign w:val="top"/>
+            <w:vAlign w:val="center"/>
           </w:tcPr>
           <w:p>
             <w:pPr>
@@ -833,16 +1205,16 @@
                 <w:left w:val="none" w:sz="0" w:space="0" w:color="000000"/>
                 <w:right w:val="none" w:sz="0" w:space="0" w:color="000000"/>
               </w:pBdr>
-              <w:spacing w:after="80" w:before="80" w:line="240"/>
-              <w:ind w:left="80" w:right="80" w:firstLine="0" w:firstLineChars="0"/>
-              <w:rPr>
-                <w:rFonts w:ascii="Arial" w:hAnsi="Arial" w:eastAsia="Arial" w:cs="Arial"/>
-                <w:i w:val="false"/>
-                <w:b w:val="false"/>
-                <w:u w:val="none"/>
-                <w:strike w:val="false"/>
-                <w:sz w:val="20"/>
-                <w:szCs w:val="20"/>
+              <w:spacing w:after="140" w:before="140" w:line="240"/>
+              <w:ind w:left="140" w:right="140" w:firstLine="0" w:firstLineChars="0"/>
+              <w:rPr>
+                <w:rFonts w:ascii="Arial" w:hAnsi="Arial" w:eastAsia="Arial" w:cs="Arial"/>
+                <w:i w:val="false"/>
+                <w:b w:val="false"/>
+                <w:u w:val="none"/>
+                <w:strike w:val="false"/>
+                <w:sz w:val="24"/>
+                <w:szCs w:val="24"/>
                 <w:color w:val="000000"/>
               </w:rPr>
             </w:pPr>
@@ -853,21 +1225,21 @@
                 <w:b w:val="false"/>
                 <w:u w:val="none"/>
                 <w:strike w:val="false"/>
-                <w:sz w:val="20"/>
-                <w:szCs w:val="20"/>
-                <w:color w:val="000000"/>
-              </w:rPr>
-              <w:t xml:space="preserve">400, all scoring 58 or below</w:t>
+                <w:sz w:val="24"/>
+                <w:szCs w:val="24"/>
+                <w:color w:val="000000"/>
+              </w:rPr>
+              <w:t xml:space="preserve">200</w:t>
             </w:r>
           </w:p>
         </w:tc>
         <w:tc>
           <w:tcPr>
             <w:tcBorders>
-              <w:bottom w:val="single" w:sz="6" w:space="0" w:color="9AA8B8"/>
-              <w:top w:val="none" w:sz="0" w:space="0" w:color="000000"/>
-              <w:left w:val="none" w:sz="0" w:space="0" w:color="000000"/>
-              <w:right w:val="none" w:sz="0" w:space="0" w:color="000000"/>
+              <w:bottom w:val="single" w:sz="6" w:space="0" w:color="D9D9D9"/>
+              <w:top w:val="single" w:sz="6" w:space="0" w:color="D9D9D9"/>
+              <w:left w:val="single" w:sz="6" w:space="0" w:color="D9D9D9"/>
+              <w:right w:val="single" w:sz="6" w:space="0" w:color="D9D9D9"/>
             </w:tcBorders>
             <w:shd w:val="clear" w:color="auto" w:fill="FFFFFF"/>
             <w:tcMar>
@@ -876,7 +1248,7 @@
               <w:left w:w="0" w:type="dxa"/>
               <w:right w:w="0" w:type="dxa"/>
             </w:tcMar>
-            <w:vAlign w:val="top"/>
+            <w:vAlign w:val="center"/>
           </w:tcPr>
           <w:p>
             <w:pPr>
@@ -887,16 +1259,16 @@
                 <w:left w:val="none" w:sz="0" w:space="0" w:color="000000"/>
                 <w:right w:val="none" w:sz="0" w:space="0" w:color="000000"/>
               </w:pBdr>
-              <w:spacing w:after="80" w:before="80" w:line="240"/>
-              <w:ind w:left="80" w:right="80" w:firstLine="0" w:firstLineChars="0"/>
-              <w:rPr>
-                <w:rFonts w:ascii="Arial" w:hAnsi="Arial" w:eastAsia="Arial" w:cs="Arial"/>
-                <w:i w:val="false"/>
-                <w:b w:val="false"/>
-                <w:u w:val="none"/>
-                <w:strike w:val="false"/>
-                <w:sz w:val="20"/>
-                <w:szCs w:val="20"/>
+              <w:spacing w:after="140" w:before="140" w:line="240"/>
+              <w:ind w:left="140" w:right="140" w:firstLine="0" w:firstLineChars="0"/>
+              <w:rPr>
+                <w:rFonts w:ascii="Arial" w:hAnsi="Arial" w:eastAsia="Arial" w:cs="Arial"/>
+                <w:i w:val="false"/>
+                <w:b w:val="false"/>
+                <w:u w:val="none"/>
+                <w:strike w:val="false"/>
+                <w:sz w:val="24"/>
+                <w:szCs w:val="24"/>
                 <w:color w:val="000000"/>
               </w:rPr>
             </w:pPr>
@@ -907,21 +1279,21 @@
                 <w:b w:val="false"/>
                 <w:u w:val="none"/>
                 <w:strike w:val="false"/>
-                <w:sz w:val="20"/>
-                <w:szCs w:val="20"/>
-                <w:color w:val="000000"/>
-              </w:rPr>
-              <w:t xml:space="preserve">A lottery picked 200; the other 200 waited</w:t>
+                <w:sz w:val="24"/>
+                <w:szCs w:val="24"/>
+                <w:color w:val="000000"/>
+              </w:rPr>
+              <w:t xml:space="preserve">1,390</w:t>
             </w:r>
           </w:p>
         </w:tc>
         <w:tc>
           <w:tcPr>
             <w:tcBorders>
-              <w:bottom w:val="single" w:sz="6" w:space="0" w:color="9AA8B8"/>
-              <w:top w:val="none" w:sz="0" w:space="0" w:color="000000"/>
-              <w:left w:val="none" w:sz="0" w:space="0" w:color="000000"/>
-              <w:right w:val="none" w:sz="0" w:space="0" w:color="000000"/>
+              <w:bottom w:val="single" w:sz="6" w:space="0" w:color="D9D9D9"/>
+              <w:top w:val="single" w:sz="6" w:space="0" w:color="D9D9D9"/>
+              <w:left w:val="single" w:sz="6" w:space="0" w:color="D9D9D9"/>
+              <w:right w:val="single" w:sz="6" w:space="0" w:color="D9D9D9"/>
             </w:tcBorders>
             <w:shd w:val="clear" w:color="auto" w:fill="FFFFFF"/>
             <w:tcMar>
@@ -930,7 +1302,7 @@
               <w:left w:w="0" w:type="dxa"/>
               <w:right w:w="0" w:type="dxa"/>
             </w:tcMar>
-            <w:vAlign w:val="top"/>
+            <w:vAlign w:val="center"/>
           </w:tcPr>
           <w:p>
             <w:pPr>
@@ -941,16 +1313,16 @@
                 <w:left w:val="none" w:sz="0" w:space="0" w:color="000000"/>
                 <w:right w:val="none" w:sz="0" w:space="0" w:color="000000"/>
               </w:pBdr>
-              <w:spacing w:after="80" w:before="80" w:line="240"/>
-              <w:ind w:left="80" w:right="80" w:firstLine="0" w:firstLineChars="0"/>
-              <w:rPr>
-                <w:rFonts w:ascii="Arial" w:hAnsi="Arial" w:eastAsia="Arial" w:cs="Arial"/>
-                <w:i w:val="false"/>
-                <w:b w:val="false"/>
-                <w:u w:val="none"/>
-                <w:strike w:val="false"/>
-                <w:sz w:val="20"/>
-                <w:szCs w:val="20"/>
+              <w:spacing w:after="140" w:before="140" w:line="240"/>
+              <w:ind w:left="140" w:right="140" w:firstLine="0" w:firstLineChars="0"/>
+              <w:rPr>
+                <w:rFonts w:ascii="Arial" w:hAnsi="Arial" w:eastAsia="Arial" w:cs="Arial"/>
+                <w:i w:val="false"/>
+                <w:b w:val="false"/>
+                <w:u w:val="none"/>
+                <w:strike w:val="false"/>
+                <w:sz w:val="24"/>
+                <w:szCs w:val="24"/>
                 <w:color w:val="000000"/>
               </w:rPr>
             </w:pPr>
@@ -961,11 +1333,11 @@
                 <w:b w:val="false"/>
                 <w:u w:val="none"/>
                 <w:strike w:val="false"/>
-                <w:sz w:val="20"/>
-                <w:szCs w:val="20"/>
-                <w:color w:val="000000"/>
-              </w:rPr>
-              <w:t xml:space="preserve">Waste costs before, and 12 months after</w:t>
+                <w:sz w:val="24"/>
+                <w:szCs w:val="24"/>
+                <w:color w:val="000000"/>
+              </w:rPr>
+              <w:t xml:space="preserve">769</w:t>
             </w:r>
           </w:p>
         </w:tc>
@@ -978,19 +1350,19 @@
         <w:tc>
           <w:tcPr>
             <w:tcBorders>
-              <w:bottom w:val="single" w:sz="6" w:space="0" w:color="9AA8B8"/>
-              <w:top w:val="single" w:sz="6" w:space="0" w:color="9AA8B8"/>
-              <w:left w:val="none" w:sz="0" w:space="0" w:color="000000"/>
-              <w:right w:val="none" w:sz="0" w:space="0" w:color="000000"/>
+              <w:bottom w:val="single" w:sz="6" w:space="0" w:color="D9D9D9"/>
+              <w:top w:val="single" w:sz="6" w:space="0" w:color="D9D9D9"/>
+              <w:left w:val="single" w:sz="6" w:space="0" w:color="D9D9D9"/>
+              <w:right w:val="single" w:sz="6" w:space="0" w:color="D9D9D9"/>
             </w:tcBorders>
-            <w:shd w:val="clear" w:color="auto" w:fill="FFFFFF"/>
+            <w:shd w:val="clear" w:color="auto" w:fill="F1F5F9"/>
             <w:tcMar>
               <w:top w:w="0" w:type="dxa"/>
               <w:bottom w:w="0" w:type="dxa"/>
               <w:left w:w="0" w:type="dxa"/>
               <w:right w:w="0" w:type="dxa"/>
             </w:tcMar>
-            <w:vAlign w:val="top"/>
+            <w:vAlign w:val="center"/>
           </w:tcPr>
           <w:p>
             <w:pPr>
@@ -1001,50 +1373,50 @@
                 <w:left w:val="none" w:sz="0" w:space="0" w:color="000000"/>
                 <w:right w:val="none" w:sz="0" w:space="0" w:color="000000"/>
               </w:pBdr>
-              <w:spacing w:after="80" w:before="80" w:line="240"/>
-              <w:ind w:left="80" w:right="80" w:firstLine="0" w:firstLineChars="0"/>
-              <w:rPr>
-                <w:rFonts w:ascii="Arial" w:hAnsi="Arial" w:eastAsia="Arial" w:cs="Arial"/>
-                <w:i w:val="false"/>
-                <w:b w:val="true"/>
-                <w:u w:val="none"/>
-                <w:strike w:val="false"/>
-                <w:sz w:val="20"/>
-                <w:szCs w:val="20"/>
-                <w:color w:val="063360"/>
+              <w:spacing w:after="140" w:before="140" w:line="240"/>
+              <w:ind w:left="140" w:right="140" w:firstLine="0" w:firstLineChars="0"/>
+              <w:rPr>
+                <w:rFonts w:ascii="Arial" w:hAnsi="Arial" w:eastAsia="Arial" w:cs="Arial"/>
+                <w:i w:val="false"/>
+                <w:b w:val="false"/>
+                <w:u w:val="none"/>
+                <w:strike w:val="false"/>
+                <w:sz w:val="24"/>
+                <w:szCs w:val="24"/>
+                <w:color w:val="000000"/>
               </w:rPr>
             </w:pPr>
             <w:r>
               <w:rPr>
                 <w:rFonts w:ascii="Arial" w:hAnsi="Arial" w:eastAsia="Arial" w:cs="Arial"/>
                 <w:i w:val="false"/>
-                <w:b w:val="true"/>
-                <w:u w:val="none"/>
-                <w:strike w:val="false"/>
-                <w:sz w:val="20"/>
-                <w:szCs w:val="20"/>
-                <w:color w:val="063360"/>
-              </w:rPr>
-              <w:t xml:space="preserve">Rest of the city</w:t>
+                <w:b w:val="false"/>
+                <w:u w:val="none"/>
+                <w:strike w:val="false"/>
+                <w:sz w:val="24"/>
+                <w:szCs w:val="24"/>
+                <w:color w:val="000000"/>
+              </w:rPr>
+              <w:t xml:space="preserve">Pilot waited</w:t>
             </w:r>
           </w:p>
         </w:tc>
         <w:tc>
           <w:tcPr>
             <w:tcBorders>
-              <w:bottom w:val="single" w:sz="6" w:space="0" w:color="9AA8B8"/>
-              <w:top w:val="single" w:sz="6" w:space="0" w:color="9AA8B8"/>
-              <w:left w:val="none" w:sz="0" w:space="0" w:color="000000"/>
-              <w:right w:val="none" w:sz="0" w:space="0" w:color="000000"/>
+              <w:bottom w:val="single" w:sz="6" w:space="0" w:color="D9D9D9"/>
+              <w:top w:val="single" w:sz="6" w:space="0" w:color="D9D9D9"/>
+              <w:left w:val="single" w:sz="6" w:space="0" w:color="D9D9D9"/>
+              <w:right w:val="single" w:sz="6" w:space="0" w:color="D9D9D9"/>
             </w:tcBorders>
-            <w:shd w:val="clear" w:color="auto" w:fill="FFFFFF"/>
+            <w:shd w:val="clear" w:color="auto" w:fill="F1F5F9"/>
             <w:tcMar>
               <w:top w:w="0" w:type="dxa"/>
               <w:bottom w:w="0" w:type="dxa"/>
               <w:left w:w="0" w:type="dxa"/>
               <w:right w:w="0" w:type="dxa"/>
             </w:tcMar>
-            <w:vAlign w:val="top"/>
+            <w:vAlign w:val="center"/>
           </w:tcPr>
           <w:p>
             <w:pPr>
@@ -1055,16 +1427,16 @@
                 <w:left w:val="none" w:sz="0" w:space="0" w:color="000000"/>
                 <w:right w:val="none" w:sz="0" w:space="0" w:color="000000"/>
               </w:pBdr>
-              <w:spacing w:after="80" w:before="80" w:line="240"/>
-              <w:ind w:left="80" w:right="80" w:firstLine="0" w:firstLineChars="0"/>
-              <w:rPr>
-                <w:rFonts w:ascii="Arial" w:hAnsi="Arial" w:eastAsia="Arial" w:cs="Arial"/>
-                <w:i w:val="false"/>
-                <w:b w:val="false"/>
-                <w:u w:val="none"/>
-                <w:strike w:val="false"/>
-                <w:sz w:val="20"/>
-                <w:szCs w:val="20"/>
+              <w:spacing w:after="140" w:before="140" w:line="240"/>
+              <w:ind w:left="140" w:right="140" w:firstLine="0" w:firstLineChars="0"/>
+              <w:rPr>
+                <w:rFonts w:ascii="Arial" w:hAnsi="Arial" w:eastAsia="Arial" w:cs="Arial"/>
+                <w:i w:val="false"/>
+                <w:b w:val="false"/>
+                <w:u w:val="none"/>
+                <w:strike w:val="false"/>
+                <w:sz w:val="24"/>
+                <w:szCs w:val="24"/>
                 <w:color w:val="000000"/>
               </w:rPr>
             </w:pPr>
@@ -1075,30 +1447,30 @@
                 <w:b w:val="false"/>
                 <w:u w:val="none"/>
                 <w:strike w:val="false"/>
-                <w:sz w:val="20"/>
-                <w:szCs w:val="20"/>
-                <w:color w:val="000000"/>
-              </w:rPr>
-              <w:t xml:space="preserve">6,000, every score</w:t>
+                <w:sz w:val="24"/>
+                <w:szCs w:val="24"/>
+                <w:color w:val="000000"/>
+              </w:rPr>
+              <w:t xml:space="preserve">200</w:t>
             </w:r>
           </w:p>
         </w:tc>
         <w:tc>
           <w:tcPr>
             <w:tcBorders>
-              <w:bottom w:val="single" w:sz="6" w:space="0" w:color="9AA8B8"/>
-              <w:top w:val="single" w:sz="6" w:space="0" w:color="9AA8B8"/>
-              <w:left w:val="none" w:sz="0" w:space="0" w:color="000000"/>
-              <w:right w:val="none" w:sz="0" w:space="0" w:color="000000"/>
+              <w:bottom w:val="single" w:sz="6" w:space="0" w:color="D9D9D9"/>
+              <w:top w:val="single" w:sz="6" w:space="0" w:color="D9D9D9"/>
+              <w:left w:val="single" w:sz="6" w:space="0" w:color="D9D9D9"/>
+              <w:right w:val="single" w:sz="6" w:space="0" w:color="D9D9D9"/>
             </w:tcBorders>
-            <w:shd w:val="clear" w:color="auto" w:fill="FFFFFF"/>
+            <w:shd w:val="clear" w:color="auto" w:fill="F1F5F9"/>
             <w:tcMar>
               <w:top w:w="0" w:type="dxa"/>
               <w:bottom w:w="0" w:type="dxa"/>
               <w:left w:w="0" w:type="dxa"/>
               <w:right w:w="0" w:type="dxa"/>
             </w:tcMar>
-            <w:vAlign w:val="top"/>
+            <w:vAlign w:val="center"/>
           </w:tcPr>
           <w:p>
             <w:pPr>
@@ -1109,16 +1481,16 @@
                 <w:left w:val="none" w:sz="0" w:space="0" w:color="000000"/>
                 <w:right w:val="none" w:sz="0" w:space="0" w:color="000000"/>
               </w:pBdr>
-              <w:spacing w:after="80" w:before="80" w:line="240"/>
-              <w:ind w:left="80" w:right="80" w:firstLine="0" w:firstLineChars="0"/>
-              <w:rPr>
-                <w:rFonts w:ascii="Arial" w:hAnsi="Arial" w:eastAsia="Arial" w:cs="Arial"/>
-                <w:i w:val="false"/>
-                <w:b w:val="false"/>
-                <w:u w:val="none"/>
-                <w:strike w:val="false"/>
-                <w:sz w:val="20"/>
-                <w:szCs w:val="20"/>
+              <w:spacing w:after="140" w:before="140" w:line="240"/>
+              <w:ind w:left="140" w:right="140" w:firstLine="0" w:firstLineChars="0"/>
+              <w:rPr>
+                <w:rFonts w:ascii="Arial" w:hAnsi="Arial" w:eastAsia="Arial" w:cs="Arial"/>
+                <w:i w:val="false"/>
+                <w:b w:val="false"/>
+                <w:u w:val="none"/>
+                <w:strike w:val="false"/>
+                <w:sz w:val="24"/>
+                <w:szCs w:val="24"/>
                 <w:color w:val="000000"/>
               </w:rPr>
             </w:pPr>
@@ -1129,30 +1501,30 @@
                 <w:b w:val="false"/>
                 <w:u w:val="none"/>
                 <w:strike w:val="false"/>
-                <w:sz w:val="20"/>
-                <w:szCs w:val="20"/>
-                <w:color w:val="000000"/>
-              </w:rPr>
-              <w:t xml:space="preserve">A rule: every business scoring 58 or below took part (2,886); the 3,114 above did not</w:t>
+                <w:sz w:val="24"/>
+                <w:szCs w:val="24"/>
+                <w:color w:val="000000"/>
+              </w:rPr>
+              <w:t xml:space="preserve">1,411</w:t>
             </w:r>
           </w:p>
         </w:tc>
         <w:tc>
           <w:tcPr>
             <w:tcBorders>
-              <w:bottom w:val="single" w:sz="6" w:space="0" w:color="9AA8B8"/>
-              <w:top w:val="single" w:sz="6" w:space="0" w:color="9AA8B8"/>
-              <w:left w:val="none" w:sz="0" w:space="0" w:color="000000"/>
-              <w:right w:val="none" w:sz="0" w:space="0" w:color="000000"/>
+              <w:bottom w:val="single" w:sz="6" w:space="0" w:color="D9D9D9"/>
+              <w:top w:val="single" w:sz="6" w:space="0" w:color="D9D9D9"/>
+              <w:left w:val="single" w:sz="6" w:space="0" w:color="D9D9D9"/>
+              <w:right w:val="single" w:sz="6" w:space="0" w:color="D9D9D9"/>
             </w:tcBorders>
-            <w:shd w:val="clear" w:color="auto" w:fill="FFFFFF"/>
+            <w:shd w:val="clear" w:color="auto" w:fill="F1F5F9"/>
             <w:tcMar>
               <w:top w:w="0" w:type="dxa"/>
               <w:bottom w:w="0" w:type="dxa"/>
               <w:left w:w="0" w:type="dxa"/>
               <w:right w:w="0" w:type="dxa"/>
             </w:tcMar>
-            <w:vAlign w:val="top"/>
+            <w:vAlign w:val="center"/>
           </w:tcPr>
           <w:p>
             <w:pPr>
@@ -1163,16 +1535,16 @@
                 <w:left w:val="none" w:sz="0" w:space="0" w:color="000000"/>
                 <w:right w:val="none" w:sz="0" w:space="0" w:color="000000"/>
               </w:pBdr>
-              <w:spacing w:after="80" w:before="80" w:line="240"/>
-              <w:ind w:left="80" w:right="80" w:firstLine="0" w:firstLineChars="0"/>
-              <w:rPr>
-                <w:rFonts w:ascii="Arial" w:hAnsi="Arial" w:eastAsia="Arial" w:cs="Arial"/>
-                <w:i w:val="false"/>
-                <w:b w:val="false"/>
-                <w:u w:val="none"/>
-                <w:strike w:val="false"/>
-                <w:sz w:val="20"/>
-                <w:szCs w:val="20"/>
+              <w:spacing w:after="140" w:before="140" w:line="240"/>
+              <w:ind w:left="140" w:right="140" w:firstLine="0" w:firstLineChars="0"/>
+              <w:rPr>
+                <w:rFonts w:ascii="Arial" w:hAnsi="Arial" w:eastAsia="Arial" w:cs="Arial"/>
+                <w:i w:val="false"/>
+                <w:b w:val="false"/>
+                <w:u w:val="none"/>
+                <w:strike w:val="false"/>
+                <w:sz w:val="24"/>
+                <w:szCs w:val="24"/>
                 <w:color w:val="000000"/>
               </w:rPr>
             </w:pPr>
@@ -1183,11 +1555,455 @@
                 <w:b w:val="false"/>
                 <w:u w:val="none"/>
                 <w:strike w:val="false"/>
-                <w:sz w:val="20"/>
-                <w:szCs w:val="20"/>
-                <w:color w:val="000000"/>
-              </w:rPr>
-              <w:t xml:space="preserve">Waste costs before, and 12 months after</w:t>
+                <w:sz w:val="24"/>
+                <w:szCs w:val="24"/>
+                <w:color w:val="000000"/>
+              </w:rPr>
+              <w:t xml:space="preserve">1,783</w:t>
+            </w:r>
+          </w:p>
+        </w:tc>
+      </w:tr>
+      <w:tr>
+        <w:trPr>
+          <w:trHeight w:val="360" w:hRule="auto"/>
+        </w:trPr>
+        body3
+        <w:tc>
+          <w:tcPr>
+            <w:tcBorders>
+              <w:bottom w:val="single" w:sz="6" w:space="0" w:color="D9D9D9"/>
+              <w:top w:val="single" w:sz="6" w:space="0" w:color="D9D9D9"/>
+              <w:left w:val="single" w:sz="6" w:space="0" w:color="D9D9D9"/>
+              <w:right w:val="single" w:sz="6" w:space="0" w:color="D9D9D9"/>
+            </w:tcBorders>
+            <w:shd w:val="clear" w:color="auto" w:fill="FFFFFF"/>
+            <w:tcMar>
+              <w:top w:w="0" w:type="dxa"/>
+              <w:bottom w:w="0" w:type="dxa"/>
+              <w:left w:w="0" w:type="dxa"/>
+              <w:right w:w="0" w:type="dxa"/>
+            </w:tcMar>
+            <w:vAlign w:val="center"/>
+          </w:tcPr>
+          <w:p>
+            <w:pPr>
+              <w:jc w:val="left"/>
+              <w:pBdr>
+                <w:bottom w:val="none" w:sz="0" w:space="0" w:color="000000"/>
+                <w:top w:val="none" w:sz="0" w:space="0" w:color="000000"/>
+                <w:left w:val="none" w:sz="0" w:space="0" w:color="000000"/>
+                <w:right w:val="none" w:sz="0" w:space="0" w:color="000000"/>
+              </w:pBdr>
+              <w:spacing w:after="140" w:before="140" w:line="240"/>
+              <w:ind w:left="140" w:right="140" w:firstLine="0" w:firstLineChars="0"/>
+              <w:rPr>
+                <w:rFonts w:ascii="Arial" w:hAnsi="Arial" w:eastAsia="Arial" w:cs="Arial"/>
+                <w:i w:val="false"/>
+                <w:b w:val="false"/>
+                <w:u w:val="none"/>
+                <w:strike w:val="false"/>
+                <w:sz w:val="24"/>
+                <w:szCs w:val="24"/>
+                <w:color w:val="000000"/>
+              </w:rPr>
+            </w:pPr>
+            <w:r>
+              <w:rPr>
+                <w:rFonts w:ascii="Arial" w:hAnsi="Arial" w:eastAsia="Arial" w:cs="Arial"/>
+                <w:i w:val="false"/>
+                <w:b w:val="false"/>
+                <w:u w:val="none"/>
+                <w:strike w:val="false"/>
+                <w:sz w:val="24"/>
+                <w:szCs w:val="24"/>
+                <w:color w:val="000000"/>
+              </w:rPr>
+              <w:t xml:space="preserve">City took part</w:t>
+            </w:r>
+          </w:p>
+        </w:tc>
+        <w:tc>
+          <w:tcPr>
+            <w:tcBorders>
+              <w:bottom w:val="single" w:sz="6" w:space="0" w:color="D9D9D9"/>
+              <w:top w:val="single" w:sz="6" w:space="0" w:color="D9D9D9"/>
+              <w:left w:val="single" w:sz="6" w:space="0" w:color="D9D9D9"/>
+              <w:right w:val="single" w:sz="6" w:space="0" w:color="D9D9D9"/>
+            </w:tcBorders>
+            <w:shd w:val="clear" w:color="auto" w:fill="FFFFFF"/>
+            <w:tcMar>
+              <w:top w:w="0" w:type="dxa"/>
+              <w:bottom w:w="0" w:type="dxa"/>
+              <w:left w:w="0" w:type="dxa"/>
+              <w:right w:w="0" w:type="dxa"/>
+            </w:tcMar>
+            <w:vAlign w:val="center"/>
+          </w:tcPr>
+          <w:p>
+            <w:pPr>
+              <w:jc w:val="left"/>
+              <w:pBdr>
+                <w:bottom w:val="none" w:sz="0" w:space="0" w:color="000000"/>
+                <w:top w:val="none" w:sz="0" w:space="0" w:color="000000"/>
+                <w:left w:val="none" w:sz="0" w:space="0" w:color="000000"/>
+                <w:right w:val="none" w:sz="0" w:space="0" w:color="000000"/>
+              </w:pBdr>
+              <w:spacing w:after="140" w:before="140" w:line="240"/>
+              <w:ind w:left="140" w:right="140" w:firstLine="0" w:firstLineChars="0"/>
+              <w:rPr>
+                <w:rFonts w:ascii="Arial" w:hAnsi="Arial" w:eastAsia="Arial" w:cs="Arial"/>
+                <w:i w:val="false"/>
+                <w:b w:val="false"/>
+                <w:u w:val="none"/>
+                <w:strike w:val="false"/>
+                <w:sz w:val="24"/>
+                <w:szCs w:val="24"/>
+                <w:color w:val="000000"/>
+              </w:rPr>
+            </w:pPr>
+            <w:r>
+              <w:rPr>
+                <w:rFonts w:ascii="Arial" w:hAnsi="Arial" w:eastAsia="Arial" w:cs="Arial"/>
+                <w:i w:val="false"/>
+                <w:b w:val="false"/>
+                <w:u w:val="none"/>
+                <w:strike w:val="false"/>
+                <w:sz w:val="24"/>
+                <w:szCs w:val="24"/>
+                <w:color w:val="000000"/>
+              </w:rPr>
+              <w:t xml:space="preserve">4,794</w:t>
+            </w:r>
+          </w:p>
+        </w:tc>
+        <w:tc>
+          <w:tcPr>
+            <w:tcBorders>
+              <w:bottom w:val="single" w:sz="6" w:space="0" w:color="D9D9D9"/>
+              <w:top w:val="single" w:sz="6" w:space="0" w:color="D9D9D9"/>
+              <w:left w:val="single" w:sz="6" w:space="0" w:color="D9D9D9"/>
+              <w:right w:val="single" w:sz="6" w:space="0" w:color="D9D9D9"/>
+            </w:tcBorders>
+            <w:shd w:val="clear" w:color="auto" w:fill="FFFFFF"/>
+            <w:tcMar>
+              <w:top w:w="0" w:type="dxa"/>
+              <w:bottom w:w="0" w:type="dxa"/>
+              <w:left w:w="0" w:type="dxa"/>
+              <w:right w:w="0" w:type="dxa"/>
+            </w:tcMar>
+            <w:vAlign w:val="center"/>
+          </w:tcPr>
+          <w:p>
+            <w:pPr>
+              <w:jc w:val="left"/>
+              <w:pBdr>
+                <w:bottom w:val="none" w:sz="0" w:space="0" w:color="000000"/>
+                <w:top w:val="none" w:sz="0" w:space="0" w:color="000000"/>
+                <w:left w:val="none" w:sz="0" w:space="0" w:color="000000"/>
+                <w:right w:val="none" w:sz="0" w:space="0" w:color="000000"/>
+              </w:pBdr>
+              <w:spacing w:after="140" w:before="140" w:line="240"/>
+              <w:ind w:left="140" w:right="140" w:firstLine="0" w:firstLineChars="0"/>
+              <w:rPr>
+                <w:rFonts w:ascii="Arial" w:hAnsi="Arial" w:eastAsia="Arial" w:cs="Arial"/>
+                <w:i w:val="false"/>
+                <w:b w:val="false"/>
+                <w:u w:val="none"/>
+                <w:strike w:val="false"/>
+                <w:sz w:val="24"/>
+                <w:szCs w:val="24"/>
+                <w:color w:val="000000"/>
+              </w:rPr>
+            </w:pPr>
+            <w:r>
+              <w:rPr>
+                <w:rFonts w:ascii="Arial" w:hAnsi="Arial" w:eastAsia="Arial" w:cs="Arial"/>
+                <w:i w:val="false"/>
+                <w:b w:val="false"/>
+                <w:u w:val="none"/>
+                <w:strike w:val="false"/>
+                <w:sz w:val="24"/>
+                <w:szCs w:val="24"/>
+                <w:color w:val="000000"/>
+              </w:rPr>
+              <w:t xml:space="preserve">1,432</w:t>
+            </w:r>
+          </w:p>
+        </w:tc>
+        <w:tc>
+          <w:tcPr>
+            <w:tcBorders>
+              <w:bottom w:val="single" w:sz="6" w:space="0" w:color="D9D9D9"/>
+              <w:top w:val="single" w:sz="6" w:space="0" w:color="D9D9D9"/>
+              <w:left w:val="single" w:sz="6" w:space="0" w:color="D9D9D9"/>
+              <w:right w:val="single" w:sz="6" w:space="0" w:color="D9D9D9"/>
+            </w:tcBorders>
+            <w:shd w:val="clear" w:color="auto" w:fill="FFFFFF"/>
+            <w:tcMar>
+              <w:top w:w="0" w:type="dxa"/>
+              <w:bottom w:w="0" w:type="dxa"/>
+              <w:left w:w="0" w:type="dxa"/>
+              <w:right w:w="0" w:type="dxa"/>
+            </w:tcMar>
+            <w:vAlign w:val="center"/>
+          </w:tcPr>
+          <w:p>
+            <w:pPr>
+              <w:jc w:val="left"/>
+              <w:pBdr>
+                <w:bottom w:val="none" w:sz="0" w:space="0" w:color="000000"/>
+                <w:top w:val="none" w:sz="0" w:space="0" w:color="000000"/>
+                <w:left w:val="none" w:sz="0" w:space="0" w:color="000000"/>
+                <w:right w:val="none" w:sz="0" w:space="0" w:color="000000"/>
+              </w:pBdr>
+              <w:spacing w:after="140" w:before="140" w:line="240"/>
+              <w:ind w:left="140" w:right="140" w:firstLine="0" w:firstLineChars="0"/>
+              <w:rPr>
+                <w:rFonts w:ascii="Arial" w:hAnsi="Arial" w:eastAsia="Arial" w:cs="Arial"/>
+                <w:i w:val="false"/>
+                <w:b w:val="false"/>
+                <w:u w:val="none"/>
+                <w:strike w:val="false"/>
+                <w:sz w:val="24"/>
+                <w:szCs w:val="24"/>
+                <w:color w:val="000000"/>
+              </w:rPr>
+            </w:pPr>
+            <w:r>
+              <w:rPr>
+                <w:rFonts w:ascii="Arial" w:hAnsi="Arial" w:eastAsia="Arial" w:cs="Arial"/>
+                <w:i w:val="false"/>
+                <w:b w:val="false"/>
+                <w:u w:val="none"/>
+                <w:strike w:val="false"/>
+                <w:sz w:val="24"/>
+                <w:szCs w:val="24"/>
+                <w:color w:val="000000"/>
+              </w:rPr>
+              <w:t xml:space="preserve">763</w:t>
+            </w:r>
+          </w:p>
+        </w:tc>
+      </w:tr>
+      <w:tr>
+        <w:trPr>
+          <w:trHeight w:val="360" w:hRule="auto"/>
+        </w:trPr>
+        body4
+        <w:tc>
+          <w:tcPr>
+            <w:tcBorders>
+              <w:bottom w:val="single" w:sz="6" w:space="0" w:color="D9D9D9"/>
+              <w:top w:val="single" w:sz="6" w:space="0" w:color="D9D9D9"/>
+              <w:left w:val="single" w:sz="6" w:space="0" w:color="D9D9D9"/>
+              <w:right w:val="single" w:sz="6" w:space="0" w:color="D9D9D9"/>
+            </w:tcBorders>
+            <w:shd w:val="clear" w:color="auto" w:fill="F1F5F9"/>
+            <w:tcMar>
+              <w:top w:w="0" w:type="dxa"/>
+              <w:bottom w:w="0" w:type="dxa"/>
+              <w:left w:w="0" w:type="dxa"/>
+              <w:right w:w="0" w:type="dxa"/>
+            </w:tcMar>
+            <w:vAlign w:val="center"/>
+          </w:tcPr>
+          <w:p>
+            <w:pPr>
+              <w:jc w:val="left"/>
+              <w:pBdr>
+                <w:bottom w:val="none" w:sz="0" w:space="0" w:color="000000"/>
+                <w:top w:val="none" w:sz="0" w:space="0" w:color="000000"/>
+                <w:left w:val="none" w:sz="0" w:space="0" w:color="000000"/>
+                <w:right w:val="none" w:sz="0" w:space="0" w:color="000000"/>
+              </w:pBdr>
+              <w:spacing w:after="140" w:before="140" w:line="240"/>
+              <w:ind w:left="140" w:right="140" w:firstLine="0" w:firstLineChars="0"/>
+              <w:rPr>
+                <w:rFonts w:ascii="Arial" w:hAnsi="Arial" w:eastAsia="Arial" w:cs="Arial"/>
+                <w:i w:val="false"/>
+                <w:b w:val="false"/>
+                <w:u w:val="none"/>
+                <w:strike w:val="false"/>
+                <w:sz w:val="24"/>
+                <w:szCs w:val="24"/>
+                <w:color w:val="000000"/>
+              </w:rPr>
+            </w:pPr>
+            <w:r>
+              <w:rPr>
+                <w:rFonts w:ascii="Arial" w:hAnsi="Arial" w:eastAsia="Arial" w:cs="Arial"/>
+                <w:i w:val="false"/>
+                <w:b w:val="false"/>
+                <w:u w:val="none"/>
+                <w:strike w:val="false"/>
+                <w:sz w:val="24"/>
+                <w:szCs w:val="24"/>
+                <w:color w:val="000000"/>
+              </w:rPr>
+              <w:t xml:space="preserve">City did not take part</w:t>
+            </w:r>
+          </w:p>
+        </w:tc>
+        <w:tc>
+          <w:tcPr>
+            <w:tcBorders>
+              <w:bottom w:val="single" w:sz="6" w:space="0" w:color="D9D9D9"/>
+              <w:top w:val="single" w:sz="6" w:space="0" w:color="D9D9D9"/>
+              <w:left w:val="single" w:sz="6" w:space="0" w:color="D9D9D9"/>
+              <w:right w:val="single" w:sz="6" w:space="0" w:color="D9D9D9"/>
+            </w:tcBorders>
+            <w:shd w:val="clear" w:color="auto" w:fill="F1F5F9"/>
+            <w:tcMar>
+              <w:top w:w="0" w:type="dxa"/>
+              <w:bottom w:w="0" w:type="dxa"/>
+              <w:left w:w="0" w:type="dxa"/>
+              <w:right w:w="0" w:type="dxa"/>
+            </w:tcMar>
+            <w:vAlign w:val="center"/>
+          </w:tcPr>
+          <w:p>
+            <w:pPr>
+              <w:jc w:val="left"/>
+              <w:pBdr>
+                <w:bottom w:val="none" w:sz="0" w:space="0" w:color="000000"/>
+                <w:top w:val="none" w:sz="0" w:space="0" w:color="000000"/>
+                <w:left w:val="none" w:sz="0" w:space="0" w:color="000000"/>
+                <w:right w:val="none" w:sz="0" w:space="0" w:color="000000"/>
+              </w:pBdr>
+              <w:spacing w:after="140" w:before="140" w:line="240"/>
+              <w:ind w:left="140" w:right="140" w:firstLine="0" w:firstLineChars="0"/>
+              <w:rPr>
+                <w:rFonts w:ascii="Arial" w:hAnsi="Arial" w:eastAsia="Arial" w:cs="Arial"/>
+                <w:i w:val="false"/>
+                <w:b w:val="false"/>
+                <w:u w:val="none"/>
+                <w:strike w:val="false"/>
+                <w:sz w:val="24"/>
+                <w:szCs w:val="24"/>
+                <w:color w:val="000000"/>
+              </w:rPr>
+            </w:pPr>
+            <w:r>
+              <w:rPr>
+                <w:rFonts w:ascii="Arial" w:hAnsi="Arial" w:eastAsia="Arial" w:cs="Arial"/>
+                <w:i w:val="false"/>
+                <w:b w:val="false"/>
+                <w:u w:val="none"/>
+                <w:strike w:val="false"/>
+                <w:sz w:val="24"/>
+                <w:szCs w:val="24"/>
+                <w:color w:val="000000"/>
+              </w:rPr>
+              <w:t xml:space="preserve">5,206</w:t>
+            </w:r>
+          </w:p>
+        </w:tc>
+        <w:tc>
+          <w:tcPr>
+            <w:tcBorders>
+              <w:bottom w:val="single" w:sz="6" w:space="0" w:color="D9D9D9"/>
+              <w:top w:val="single" w:sz="6" w:space="0" w:color="D9D9D9"/>
+              <w:left w:val="single" w:sz="6" w:space="0" w:color="D9D9D9"/>
+              <w:right w:val="single" w:sz="6" w:space="0" w:color="D9D9D9"/>
+            </w:tcBorders>
+            <w:shd w:val="clear" w:color="auto" w:fill="F1F5F9"/>
+            <w:tcMar>
+              <w:top w:w="0" w:type="dxa"/>
+              <w:bottom w:w="0" w:type="dxa"/>
+              <w:left w:w="0" w:type="dxa"/>
+              <w:right w:w="0" w:type="dxa"/>
+            </w:tcMar>
+            <w:vAlign w:val="center"/>
+          </w:tcPr>
+          <w:p>
+            <w:pPr>
+              <w:jc w:val="left"/>
+              <w:pBdr>
+                <w:bottom w:val="none" w:sz="0" w:space="0" w:color="000000"/>
+                <w:top w:val="none" w:sz="0" w:space="0" w:color="000000"/>
+                <w:left w:val="none" w:sz="0" w:space="0" w:color="000000"/>
+                <w:right w:val="none" w:sz="0" w:space="0" w:color="000000"/>
+              </w:pBdr>
+              <w:spacing w:after="140" w:before="140" w:line="240"/>
+              <w:ind w:left="140" w:right="140" w:firstLine="0" w:firstLineChars="0"/>
+              <w:rPr>
+                <w:rFonts w:ascii="Arial" w:hAnsi="Arial" w:eastAsia="Arial" w:cs="Arial"/>
+                <w:i w:val="false"/>
+                <w:b w:val="false"/>
+                <w:u w:val="none"/>
+                <w:strike w:val="false"/>
+                <w:sz w:val="24"/>
+                <w:szCs w:val="24"/>
+                <w:color w:val="000000"/>
+              </w:rPr>
+            </w:pPr>
+            <w:r>
+              <w:rPr>
+                <w:rFonts w:ascii="Arial" w:hAnsi="Arial" w:eastAsia="Arial" w:cs="Arial"/>
+                <w:i w:val="false"/>
+                <w:b w:val="false"/>
+                <w:u w:val="none"/>
+                <w:strike w:val="false"/>
+                <w:sz w:val="24"/>
+                <w:szCs w:val="24"/>
+                <w:color w:val="000000"/>
+              </w:rPr>
+              <w:t xml:space="preserve">2,258</w:t>
+            </w:r>
+          </w:p>
+        </w:tc>
+        <w:tc>
+          <w:tcPr>
+            <w:tcBorders>
+              <w:bottom w:val="single" w:sz="6" w:space="0" w:color="D9D9D9"/>
+              <w:top w:val="single" w:sz="6" w:space="0" w:color="D9D9D9"/>
+              <w:left w:val="single" w:sz="6" w:space="0" w:color="D9D9D9"/>
+              <w:right w:val="single" w:sz="6" w:space="0" w:color="D9D9D9"/>
+            </w:tcBorders>
+            <w:shd w:val="clear" w:color="auto" w:fill="F1F5F9"/>
+            <w:tcMar>
+              <w:top w:w="0" w:type="dxa"/>
+              <w:bottom w:w="0" w:type="dxa"/>
+              <w:left w:w="0" w:type="dxa"/>
+              <w:right w:w="0" w:type="dxa"/>
+            </w:tcMar>
+            <w:vAlign w:val="center"/>
+          </w:tcPr>
+          <w:p>
+            <w:pPr>
+              <w:jc w:val="left"/>
+              <w:pBdr>
+                <w:bottom w:val="none" w:sz="0" w:space="0" w:color="000000"/>
+                <w:top w:val="none" w:sz="0" w:space="0" w:color="000000"/>
+                <w:left w:val="none" w:sz="0" w:space="0" w:color="000000"/>
+                <w:right w:val="none" w:sz="0" w:space="0" w:color="000000"/>
+              </w:pBdr>
+              <w:spacing w:after="140" w:before="140" w:line="240"/>
+              <w:ind w:left="140" w:right="140" w:firstLine="0" w:firstLineChars="0"/>
+              <w:rPr>
+                <w:rFonts w:ascii="Arial" w:hAnsi="Arial" w:eastAsia="Arial" w:cs="Arial"/>
+                <w:i w:val="false"/>
+                <w:b w:val="false"/>
+                <w:u w:val="none"/>
+                <w:strike w:val="false"/>
+                <w:sz w:val="24"/>
+                <w:szCs w:val="24"/>
+                <w:color w:val="000000"/>
+              </w:rPr>
+            </w:pPr>
+            <w:r>
+              <w:rPr>
+                <w:rFonts w:ascii="Arial" w:hAnsi="Arial" w:eastAsia="Arial" w:cs="Arial"/>
+                <w:i w:val="false"/>
+                <w:b w:val="false"/>
+                <w:u w:val="none"/>
+                <w:strike w:val="false"/>
+                <w:sz w:val="24"/>
+                <w:szCs w:val="24"/>
+                <w:color w:val="000000"/>
+              </w:rPr>
+              <w:t xml:space="preserve">2,401</w:t>
             </w:r>
           </w:p>
         </w:tc>
@@ -1203,7 +2019,7 @@
           <w:left w:val="none" w:sz="0" w:space="0" w:color="000000"/>
           <w:right w:val="none" w:sz="0" w:space="0" w:color="000000"/>
         </w:pBdr>
-        <w:spacing w:after="80" w:before="0" w:line="240"/>
+        <w:spacing w:after="160" w:before="0" w:line="240"/>
         <w:ind w:left="0" w:right="0" w:firstLine="0" w:firstLineChars="0"/>
       </w:pPr>
       <w:r>
@@ -1213,11 +2029,11 @@
           <w:b w:val="false"/>
           <w:u w:val="none"/>
           <w:strike w:val="false"/>
-          <w:sz w:val="21"/>
-          <w:szCs w:val="21"/>
+          <w:sz w:val="22"/>
+          <w:szCs w:val="22"/>
           <w:color w:val="000000"/>
         </w:rPr>
-        <w:t xml:space="preserve"/>
+        <w:t xml:space="preserve">These are recorded means, not causal effect estimates. Values are rounded. The evaluation result belongs to the session extract.</w:t>
       </w:r>
     </w:p>
     <w:p>
@@ -1230,7 +2046,7 @@
           <w:left w:val="none" w:sz="0" w:space="0" w:color="000000"/>
           <w:right w:val="none" w:sz="0" w:space="0" w:color="000000"/>
         </w:pBdr>
-        <w:spacing w:after="60" w:before="0" w:line="240"/>
+        <w:spacing w:after="120" w:before="0" w:line="240"/>
         <w:ind w:left="0" w:right="0" w:firstLine="0" w:firstLineChars="0"/>
       </w:pPr>
       <w:r>
@@ -1240,50 +2056,22 @@
           <w:b w:val="true"/>
           <w:u w:val="none"/>
           <w:strike w:val="false"/>
-          <w:sz w:val="25"/>
-          <w:szCs w:val="25"/>
-          <w:color w:val="215A9E"/>
+          <w:sz w:val="28"/>
+          <w:szCs w:val="28"/>
+          <w:color w:val="000000"/>
         </w:rPr>
-        <w:t xml:space="preserve">Four groups of businesses</w:t>
-      </w:r>
-    </w:p>
-    <w:p>
-      <w:pPr>
-        <w:pStyle w:val="Normal"/>
-        <w:jc w:val="left"/>
-        <w:pBdr>
-          <w:bottom w:val="none" w:sz="0" w:space="0" w:color="000000"/>
-          <w:top w:val="none" w:sz="0" w:space="0" w:color="000000"/>
-          <w:left w:val="none" w:sz="0" w:space="0" w:color="000000"/>
-          <w:right w:val="none" w:sz="0" w:space="0" w:color="000000"/>
-        </w:pBdr>
-        <w:spacing w:after="60" w:before="0" w:line="240"/>
-        <w:ind w:left="0" w:right="0" w:firstLine="0" w:firstLineChars="0"/>
-      </w:pPr>
-      <w:r>
-        <w:rPr>
-          <w:rFonts w:ascii="Arial" w:hAnsi="Arial" w:eastAsia="Arial" w:cs="Arial"/>
-          <w:i w:val="false"/>
-          <w:b w:val="false"/>
-          <w:u w:val="none"/>
-          <w:strike w:val="false"/>
-          <w:sz w:val="19"/>
-          <w:szCs w:val="19"/>
-          <w:color w:val="545860"/>
-        </w:rPr>
-        <w:t xml:space="preserve">Average waste costs per business, in AED, before and 12 months after.</w:t>
+        <w:t xml:space="preserve">Column meanings</w:t>
       </w:r>
     </w:p>
     <w:tbl xmlns:a="http://schemas.openxmlformats.org/drawingml/2006/main" xmlns:pic="http://schemas.openxmlformats.org/drawingml/2006/picture">
       <w:tblPr>
         <w:tblLayout w:type="fixed"/>
-        <w:jc w:val="center"/>
+        <w:jc w:val="start"/>
         <w:tblLook w:firstRow="1" w:lastRow="0" w:firstColumn="0" w:lastColumn="0" w:noHBand="0" w:noVBand="1"/>
       </w:tblPr>
       <w:tblGrid>
-        <w:gridCol w:w="2880"/>
-        <w:gridCol w:w="3528"/>
-        <w:gridCol w:w="3528"/>
+        <w:gridCol w:w="3888"/>
+        <w:gridCol w:w="5184"/>
       </w:tblGrid>
       <w:tr>
         <w:trPr>
@@ -1294,19 +2082,19 @@
         <w:tc>
           <w:tcPr>
             <w:tcBorders>
-              <w:bottom w:val="none" w:sz="0" w:space="0" w:color="000000"/>
-              <w:top w:val="single" w:sz="10" w:space="0" w:color="063360"/>
-              <w:left w:val="none" w:sz="0" w:space="0" w:color="000000"/>
-              <w:right w:val="none" w:sz="0" w:space="0" w:color="000000"/>
+              <w:bottom w:val="single" w:sz="6" w:space="0" w:color="D9D9D9"/>
+              <w:top w:val="single" w:sz="6" w:space="0" w:color="D9D9D9"/>
+              <w:left w:val="single" w:sz="6" w:space="0" w:color="D9D9D9"/>
+              <w:right w:val="single" w:sz="6" w:space="0" w:color="D9D9D9"/>
             </w:tcBorders>
-            <w:shd w:val="clear" w:color="auto" w:fill="E3EBF5"/>
+            <w:shd w:val="clear" w:color="auto" w:fill="063360"/>
             <w:tcMar>
               <w:top w:w="0" w:type="dxa"/>
               <w:bottom w:w="0" w:type="dxa"/>
               <w:left w:w="0" w:type="dxa"/>
               <w:right w:w="0" w:type="dxa"/>
             </w:tcMar>
-            <w:vAlign w:val="top"/>
+            <w:vAlign w:val="center"/>
           </w:tcPr>
           <w:p>
             <w:pPr>
@@ -1317,17 +2105,17 @@
                 <w:left w:val="none" w:sz="0" w:space="0" w:color="000000"/>
                 <w:right w:val="none" w:sz="0" w:space="0" w:color="000000"/>
               </w:pBdr>
-              <w:spacing w:after="80" w:before="80" w:line="240"/>
-              <w:ind w:left="80" w:right="80" w:firstLine="0" w:firstLineChars="0"/>
+              <w:spacing w:after="140" w:before="140" w:line="240"/>
+              <w:ind w:left="140" w:right="140" w:firstLine="0" w:firstLineChars="0"/>
               <w:rPr>
                 <w:rFonts w:ascii="Arial" w:hAnsi="Arial" w:eastAsia="Arial" w:cs="Arial"/>
                 <w:i w:val="false"/>
                 <w:b w:val="true"/>
                 <w:u w:val="none"/>
                 <w:strike w:val="false"/>
-                <w:sz w:val="20"/>
-                <w:szCs w:val="20"/>
-                <w:color w:val="063360"/>
+                <w:sz w:val="24"/>
+                <w:szCs w:val="24"/>
+                <w:color w:val="FFFFFF"/>
               </w:rPr>
             </w:pPr>
             <w:r>
@@ -1337,30 +2125,30 @@
                 <w:b w:val="true"/>
                 <w:u w:val="none"/>
                 <w:strike w:val="false"/>
-                <w:sz w:val="20"/>
-                <w:szCs w:val="20"/>
-                <w:color w:val="063360"/>
-              </w:rPr>
-              <w:t xml:space="preserve"> </w:t>
+                <w:sz w:val="24"/>
+                <w:szCs w:val="24"/>
+                <w:color w:val="FFFFFF"/>
+              </w:rPr>
+              <w:t xml:space="preserve">Column</w:t>
             </w:r>
           </w:p>
         </w:tc>
         <w:tc>
           <w:tcPr>
             <w:tcBorders>
-              <w:bottom w:val="none" w:sz="0" w:space="0" w:color="000000"/>
-              <w:top w:val="single" w:sz="10" w:space="0" w:color="063360"/>
-              <w:left w:val="none" w:sz="0" w:space="0" w:color="000000"/>
-              <w:right w:val="none" w:sz="0" w:space="0" w:color="000000"/>
+              <w:bottom w:val="single" w:sz="6" w:space="0" w:color="D9D9D9"/>
+              <w:top w:val="single" w:sz="6" w:space="0" w:color="D9D9D9"/>
+              <w:left w:val="single" w:sz="6" w:space="0" w:color="D9D9D9"/>
+              <w:right w:val="single" w:sz="6" w:space="0" w:color="D9D9D9"/>
             </w:tcBorders>
-            <w:shd w:val="clear" w:color="auto" w:fill="E3EBF5"/>
+            <w:shd w:val="clear" w:color="auto" w:fill="063360"/>
             <w:tcMar>
               <w:top w:w="0" w:type="dxa"/>
               <w:bottom w:w="0" w:type="dxa"/>
               <w:left w:w="0" w:type="dxa"/>
               <w:right w:w="0" w:type="dxa"/>
             </w:tcMar>
-            <w:vAlign w:val="top"/>
+            <w:vAlign w:val="center"/>
           </w:tcPr>
           <w:p>
             <w:pPr>
@@ -1371,17 +2159,17 @@
                 <w:left w:val="none" w:sz="0" w:space="0" w:color="000000"/>
                 <w:right w:val="none" w:sz="0" w:space="0" w:color="000000"/>
               </w:pBdr>
-              <w:spacing w:after="80" w:before="80" w:line="240"/>
-              <w:ind w:left="80" w:right="80" w:firstLine="0" w:firstLineChars="0"/>
+              <w:spacing w:after="140" w:before="140" w:line="240"/>
+              <w:ind w:left="140" w:right="140" w:firstLine="0" w:firstLineChars="0"/>
               <w:rPr>
                 <w:rFonts w:ascii="Arial" w:hAnsi="Arial" w:eastAsia="Arial" w:cs="Arial"/>
                 <w:i w:val="false"/>
                 <w:b w:val="true"/>
                 <w:u w:val="none"/>
                 <w:strike w:val="false"/>
-                <w:sz w:val="20"/>
-                <w:szCs w:val="20"/>
-                <w:color w:val="063360"/>
+                <w:sz w:val="24"/>
+                <w:szCs w:val="24"/>
+                <w:color w:val="FFFFFF"/>
               </w:rPr>
             </w:pPr>
             <w:r>
@@ -1391,65 +2179,11 @@
                 <w:b w:val="true"/>
                 <w:u w:val="none"/>
                 <w:strike w:val="false"/>
-                <w:sz w:val="20"/>
-                <w:szCs w:val="20"/>
-                <w:color w:val="063360"/>
-              </w:rPr>
-              <w:t xml:space="preserve">Took part</w:t>
-            </w:r>
-          </w:p>
-        </w:tc>
-        <w:tc>
-          <w:tcPr>
-            <w:tcBorders>
-              <w:bottom w:val="none" w:sz="0" w:space="0" w:color="000000"/>
-              <w:top w:val="single" w:sz="10" w:space="0" w:color="063360"/>
-              <w:left w:val="none" w:sz="0" w:space="0" w:color="000000"/>
-              <w:right w:val="none" w:sz="0" w:space="0" w:color="000000"/>
-            </w:tcBorders>
-            <w:shd w:val="clear" w:color="auto" w:fill="E3EBF5"/>
-            <w:tcMar>
-              <w:top w:w="0" w:type="dxa"/>
-              <w:bottom w:w="0" w:type="dxa"/>
-              <w:left w:w="0" w:type="dxa"/>
-              <w:right w:w="0" w:type="dxa"/>
-            </w:tcMar>
-            <w:vAlign w:val="top"/>
-          </w:tcPr>
-          <w:p>
-            <w:pPr>
-              <w:jc w:val="left"/>
-              <w:pBdr>
-                <w:bottom w:val="none" w:sz="0" w:space="0" w:color="000000"/>
-                <w:top w:val="none" w:sz="0" w:space="0" w:color="000000"/>
-                <w:left w:val="none" w:sz="0" w:space="0" w:color="000000"/>
-                <w:right w:val="none" w:sz="0" w:space="0" w:color="000000"/>
-              </w:pBdr>
-              <w:spacing w:after="80" w:before="80" w:line="240"/>
-              <w:ind w:left="80" w:right="80" w:firstLine="0" w:firstLineChars="0"/>
-              <w:rPr>
-                <w:rFonts w:ascii="Arial" w:hAnsi="Arial" w:eastAsia="Arial" w:cs="Arial"/>
-                <w:i w:val="false"/>
-                <w:b w:val="true"/>
-                <w:u w:val="none"/>
-                <w:strike w:val="false"/>
-                <w:sz w:val="20"/>
-                <w:szCs w:val="20"/>
-                <w:color w:val="063360"/>
-              </w:rPr>
-            </w:pPr>
-            <w:r>
-              <w:rPr>
-                <w:rFonts w:ascii="Arial" w:hAnsi="Arial" w:eastAsia="Arial" w:cs="Arial"/>
-                <w:i w:val="false"/>
-                <w:b w:val="true"/>
-                <w:u w:val="none"/>
-                <w:strike w:val="false"/>
-                <w:sz w:val="20"/>
-                <w:szCs w:val="20"/>
-                <w:color w:val="063360"/>
-              </w:rPr>
-              <w:t xml:space="preserve">Did not take part</w:t>
+                <w:sz w:val="24"/>
+                <w:szCs w:val="24"/>
+                <w:color w:val="FFFFFF"/>
+              </w:rPr>
+              <w:t xml:space="preserve">Meaning</w:t>
             </w:r>
           </w:p>
         </w:tc>
@@ -1462,10 +2196,10 @@
         <w:tc>
           <w:tcPr>
             <w:tcBorders>
-              <w:bottom w:val="single" w:sz="6" w:space="0" w:color="9AA8B8"/>
-              <w:top w:val="none" w:sz="0" w:space="0" w:color="000000"/>
-              <w:left w:val="none" w:sz="0" w:space="0" w:color="000000"/>
-              <w:right w:val="none" w:sz="0" w:space="0" w:color="000000"/>
+              <w:bottom w:val="single" w:sz="6" w:space="0" w:color="D9D9D9"/>
+              <w:top w:val="single" w:sz="6" w:space="0" w:color="D9D9D9"/>
+              <w:left w:val="single" w:sz="6" w:space="0" w:color="D9D9D9"/>
+              <w:right w:val="single" w:sz="6" w:space="0" w:color="D9D9D9"/>
             </w:tcBorders>
             <w:shd w:val="clear" w:color="auto" w:fill="FFFFFF"/>
             <w:tcMar>
@@ -1474,7 +2208,7 @@
               <w:left w:w="0" w:type="dxa"/>
               <w:right w:w="0" w:type="dxa"/>
             </w:tcMar>
-            <w:vAlign w:val="top"/>
+            <w:vAlign w:val="center"/>
           </w:tcPr>
           <w:p>
             <w:pPr>
@@ -1485,41 +2219,41 @@
                 <w:left w:val="none" w:sz="0" w:space="0" w:color="000000"/>
                 <w:right w:val="none" w:sz="0" w:space="0" w:color="000000"/>
               </w:pBdr>
-              <w:spacing w:after="80" w:before="80" w:line="240"/>
-              <w:ind w:left="80" w:right="80" w:firstLine="0" w:firstLineChars="0"/>
-              <w:rPr>
-                <w:rFonts w:ascii="Arial" w:hAnsi="Arial" w:eastAsia="Arial" w:cs="Arial"/>
-                <w:i w:val="false"/>
-                <w:b w:val="true"/>
-                <w:u w:val="none"/>
-                <w:strike w:val="false"/>
-                <w:sz w:val="20"/>
-                <w:szCs w:val="20"/>
-                <w:color w:val="063360"/>
+              <w:spacing w:after="140" w:before="140" w:line="240"/>
+              <w:ind w:left="140" w:right="140" w:firstLine="0" w:firstLineChars="0"/>
+              <w:rPr>
+                <w:rFonts w:ascii="Arial" w:hAnsi="Arial" w:eastAsia="Arial" w:cs="Arial"/>
+                <w:i w:val="false"/>
+                <w:b w:val="false"/>
+                <w:u w:val="none"/>
+                <w:strike w:val="false"/>
+                <w:sz w:val="24"/>
+                <w:szCs w:val="24"/>
+                <w:color w:val="000000"/>
               </w:rPr>
             </w:pPr>
             <w:r>
               <w:rPr>
                 <w:rFonts w:ascii="Arial" w:hAnsi="Arial" w:eastAsia="Arial" w:cs="Arial"/>
                 <w:i w:val="false"/>
-                <w:b w:val="true"/>
-                <w:u w:val="none"/>
-                <w:strike w:val="false"/>
-                <w:sz w:val="20"/>
-                <w:szCs w:val="20"/>
-                <w:color w:val="063360"/>
-              </w:rPr>
-              <w:t xml:space="preserve">Pilot district (lottery)</w:t>
+                <w:b w:val="false"/>
+                <w:u w:val="none"/>
+                <w:strike w:val="false"/>
+                <w:sz w:val="24"/>
+                <w:szCs w:val="24"/>
+                <w:color w:val="000000"/>
+              </w:rPr>
+              <w:t xml:space="preserve">business and setting</w:t>
             </w:r>
           </w:p>
         </w:tc>
         <w:tc>
           <w:tcPr>
             <w:tcBorders>
-              <w:bottom w:val="single" w:sz="6" w:space="0" w:color="9AA8B8"/>
-              <w:top w:val="none" w:sz="0" w:space="0" w:color="000000"/>
-              <w:left w:val="none" w:sz="0" w:space="0" w:color="000000"/>
-              <w:right w:val="none" w:sz="0" w:space="0" w:color="000000"/>
+              <w:bottom w:val="single" w:sz="6" w:space="0" w:color="D9D9D9"/>
+              <w:top w:val="single" w:sz="6" w:space="0" w:color="D9D9D9"/>
+              <w:left w:val="single" w:sz="6" w:space="0" w:color="D9D9D9"/>
+              <w:right w:val="single" w:sz="6" w:space="0" w:color="D9D9D9"/>
             </w:tcBorders>
             <w:shd w:val="clear" w:color="auto" w:fill="FFFFFF"/>
             <w:tcMar>
@@ -1528,7 +2262,7 @@
               <w:left w:w="0" w:type="dxa"/>
               <w:right w:w="0" w:type="dxa"/>
             </w:tcMar>
-            <w:vAlign w:val="top"/>
+            <w:vAlign w:val="center"/>
           </w:tcPr>
           <w:p>
             <w:pPr>
@@ -1539,16 +2273,16 @@
                 <w:left w:val="none" w:sz="0" w:space="0" w:color="000000"/>
                 <w:right w:val="none" w:sz="0" w:space="0" w:color="000000"/>
               </w:pBdr>
-              <w:spacing w:after="80" w:before="80" w:line="240"/>
-              <w:ind w:left="80" w:right="80" w:firstLine="0" w:firstLineChars="0"/>
-              <w:rPr>
-                <w:rFonts w:ascii="Arial" w:hAnsi="Arial" w:eastAsia="Arial" w:cs="Arial"/>
-                <w:i w:val="false"/>
-                <w:b w:val="false"/>
-                <w:u w:val="none"/>
-                <w:strike w:val="false"/>
-                <w:sz w:val="20"/>
-                <w:szCs w:val="20"/>
+              <w:spacing w:after="140" w:before="140" w:line="240"/>
+              <w:ind w:left="140" w:right="140" w:firstLine="0" w:firstLineChars="0"/>
+              <w:rPr>
+                <w:rFonts w:ascii="Arial" w:hAnsi="Arial" w:eastAsia="Arial" w:cs="Arial"/>
+                <w:i w:val="false"/>
+                <w:b w:val="false"/>
+                <w:u w:val="none"/>
+                <w:strike w:val="false"/>
+                <w:sz w:val="24"/>
+                <w:szCs w:val="24"/>
                 <w:color w:val="000000"/>
               </w:rPr>
             </w:pPr>
@@ -1559,65 +2293,11 @@
                 <w:b w:val="false"/>
                 <w:u w:val="none"/>
                 <w:strike w:val="false"/>
-                <w:sz w:val="20"/>
-                <w:szCs w:val="20"/>
-                <w:color w:val="000000"/>
-              </w:rPr>
-              <w:t xml:space="preserve">200 businesses:  1,399 → 744</w:t>
-            </w:r>
-          </w:p>
-        </w:tc>
-        <w:tc>
-          <w:tcPr>
-            <w:tcBorders>
-              <w:bottom w:val="single" w:sz="6" w:space="0" w:color="9AA8B8"/>
-              <w:top w:val="none" w:sz="0" w:space="0" w:color="000000"/>
-              <w:left w:val="none" w:sz="0" w:space="0" w:color="000000"/>
-              <w:right w:val="none" w:sz="0" w:space="0" w:color="000000"/>
-            </w:tcBorders>
-            <w:shd w:val="clear" w:color="auto" w:fill="FFFFFF"/>
-            <w:tcMar>
-              <w:top w:w="0" w:type="dxa"/>
-              <w:bottom w:w="0" w:type="dxa"/>
-              <w:left w:w="0" w:type="dxa"/>
-              <w:right w:w="0" w:type="dxa"/>
-            </w:tcMar>
-            <w:vAlign w:val="top"/>
-          </w:tcPr>
-          <w:p>
-            <w:pPr>
-              <w:jc w:val="left"/>
-              <w:pBdr>
-                <w:bottom w:val="none" w:sz="0" w:space="0" w:color="000000"/>
-                <w:top w:val="none" w:sz="0" w:space="0" w:color="000000"/>
-                <w:left w:val="none" w:sz="0" w:space="0" w:color="000000"/>
-                <w:right w:val="none" w:sz="0" w:space="0" w:color="000000"/>
-              </w:pBdr>
-              <w:spacing w:after="80" w:before="80" w:line="240"/>
-              <w:ind w:left="80" w:right="80" w:firstLine="0" w:firstLineChars="0"/>
-              <w:rPr>
-                <w:rFonts w:ascii="Arial" w:hAnsi="Arial" w:eastAsia="Arial" w:cs="Arial"/>
-                <w:i w:val="false"/>
-                <w:b w:val="false"/>
-                <w:u w:val="none"/>
-                <w:strike w:val="false"/>
-                <w:sz w:val="20"/>
-                <w:szCs w:val="20"/>
-                <w:color w:val="000000"/>
-              </w:rPr>
-            </w:pPr>
-            <w:r>
-              <w:rPr>
-                <w:rFonts w:ascii="Arial" w:hAnsi="Arial" w:eastAsia="Arial" w:cs="Arial"/>
-                <w:i w:val="false"/>
-                <w:b w:val="false"/>
-                <w:u w:val="none"/>
-                <w:strike w:val="false"/>
-                <w:sz w:val="20"/>
-                <w:szCs w:val="20"/>
-                <w:color w:val="000000"/>
-              </w:rPr>
-              <w:t xml:space="preserve">200 businesses:  1,397 → 1,758</w:t>
+                <w:sz w:val="24"/>
+                <w:szCs w:val="24"/>
+                <w:color w:val="000000"/>
+              </w:rPr>
+              <w:t xml:space="preserve">Identifier; pilot district or city</w:t>
             </w:r>
           </w:p>
         </w:tc>
@@ -1630,19 +2310,19 @@
         <w:tc>
           <w:tcPr>
             <w:tcBorders>
-              <w:bottom w:val="single" w:sz="6" w:space="0" w:color="9AA8B8"/>
-              <w:top w:val="single" w:sz="6" w:space="0" w:color="9AA8B8"/>
-              <w:left w:val="none" w:sz="0" w:space="0" w:color="000000"/>
-              <w:right w:val="none" w:sz="0" w:space="0" w:color="000000"/>
+              <w:bottom w:val="single" w:sz="6" w:space="0" w:color="D9D9D9"/>
+              <w:top w:val="single" w:sz="6" w:space="0" w:color="D9D9D9"/>
+              <w:left w:val="single" w:sz="6" w:space="0" w:color="D9D9D9"/>
+              <w:right w:val="single" w:sz="6" w:space="0" w:color="D9D9D9"/>
             </w:tcBorders>
-            <w:shd w:val="clear" w:color="auto" w:fill="FFFFFF"/>
+            <w:shd w:val="clear" w:color="auto" w:fill="F1F5F9"/>
             <w:tcMar>
               <w:top w:w="0" w:type="dxa"/>
               <w:bottom w:w="0" w:type="dxa"/>
               <w:left w:w="0" w:type="dxa"/>
               <w:right w:w="0" w:type="dxa"/>
             </w:tcMar>
-            <w:vAlign w:val="top"/>
+            <w:vAlign w:val="center"/>
           </w:tcPr>
           <w:p>
             <w:pPr>
@@ -1653,50 +2333,50 @@
                 <w:left w:val="none" w:sz="0" w:space="0" w:color="000000"/>
                 <w:right w:val="none" w:sz="0" w:space="0" w:color="000000"/>
               </w:pBdr>
-              <w:spacing w:after="80" w:before="80" w:line="240"/>
-              <w:ind w:left="80" w:right="80" w:firstLine="0" w:firstLineChars="0"/>
-              <w:rPr>
-                <w:rFonts w:ascii="Arial" w:hAnsi="Arial" w:eastAsia="Arial" w:cs="Arial"/>
-                <w:i w:val="false"/>
-                <w:b w:val="true"/>
-                <w:u w:val="none"/>
-                <w:strike w:val="false"/>
-                <w:sz w:val="20"/>
-                <w:szCs w:val="20"/>
-                <w:color w:val="063360"/>
+              <w:spacing w:after="140" w:before="140" w:line="240"/>
+              <w:ind w:left="140" w:right="140" w:firstLine="0" w:firstLineChars="0"/>
+              <w:rPr>
+                <w:rFonts w:ascii="Arial" w:hAnsi="Arial" w:eastAsia="Arial" w:cs="Arial"/>
+                <w:i w:val="false"/>
+                <w:b w:val="false"/>
+                <w:u w:val="none"/>
+                <w:strike w:val="false"/>
+                <w:sz w:val="24"/>
+                <w:szCs w:val="24"/>
+                <w:color w:val="000000"/>
               </w:rPr>
             </w:pPr>
             <w:r>
               <w:rPr>
                 <w:rFonts w:ascii="Arial" w:hAnsi="Arial" w:eastAsia="Arial" w:cs="Arial"/>
                 <w:i w:val="false"/>
-                <w:b w:val="true"/>
-                <w:u w:val="none"/>
-                <w:strike w:val="false"/>
-                <w:sz w:val="20"/>
-                <w:szCs w:val="20"/>
-                <w:color w:val="063360"/>
-              </w:rPr>
-              <w:t xml:space="preserve">Rest of the city (score rule)</w:t>
+                <w:b w:val="false"/>
+                <w:u w:val="none"/>
+                <w:strike w:val="false"/>
+                <w:sz w:val="24"/>
+                <w:szCs w:val="24"/>
+                <w:color w:val="000000"/>
+              </w:rPr>
+              <w:t xml:space="preserve">score and took_part</w:t>
             </w:r>
           </w:p>
         </w:tc>
         <w:tc>
           <w:tcPr>
             <w:tcBorders>
-              <w:bottom w:val="single" w:sz="6" w:space="0" w:color="9AA8B8"/>
-              <w:top w:val="single" w:sz="6" w:space="0" w:color="9AA8B8"/>
-              <w:left w:val="none" w:sz="0" w:space="0" w:color="000000"/>
-              <w:right w:val="none" w:sz="0" w:space="0" w:color="000000"/>
+              <w:bottom w:val="single" w:sz="6" w:space="0" w:color="D9D9D9"/>
+              <w:top w:val="single" w:sz="6" w:space="0" w:color="D9D9D9"/>
+              <w:left w:val="single" w:sz="6" w:space="0" w:color="D9D9D9"/>
+              <w:right w:val="single" w:sz="6" w:space="0" w:color="D9D9D9"/>
             </w:tcBorders>
-            <w:shd w:val="clear" w:color="auto" w:fill="FFFFFF"/>
+            <w:shd w:val="clear" w:color="auto" w:fill="F1F5F9"/>
             <w:tcMar>
               <w:top w:w="0" w:type="dxa"/>
               <w:bottom w:w="0" w:type="dxa"/>
               <w:left w:w="0" w:type="dxa"/>
               <w:right w:w="0" w:type="dxa"/>
             </w:tcMar>
-            <w:vAlign w:val="top"/>
+            <w:vAlign w:val="center"/>
           </w:tcPr>
           <w:p>
             <w:pPr>
@@ -1707,16 +2387,16 @@
                 <w:left w:val="none" w:sz="0" w:space="0" w:color="000000"/>
                 <w:right w:val="none" w:sz="0" w:space="0" w:color="000000"/>
               </w:pBdr>
-              <w:spacing w:after="80" w:before="80" w:line="240"/>
-              <w:ind w:left="80" w:right="80" w:firstLine="0" w:firstLineChars="0"/>
-              <w:rPr>
-                <w:rFonts w:ascii="Arial" w:hAnsi="Arial" w:eastAsia="Arial" w:cs="Arial"/>
-                <w:i w:val="false"/>
-                <w:b w:val="false"/>
-                <w:u w:val="none"/>
-                <w:strike w:val="false"/>
-                <w:sz w:val="20"/>
-                <w:szCs w:val="20"/>
+              <w:spacing w:after="140" w:before="140" w:line="240"/>
+              <w:ind w:left="140" w:right="140" w:firstLine="0" w:firstLineChars="0"/>
+              <w:rPr>
+                <w:rFonts w:ascii="Arial" w:hAnsi="Arial" w:eastAsia="Arial" w:cs="Arial"/>
+                <w:i w:val="false"/>
+                <w:b w:val="false"/>
+                <w:u w:val="none"/>
+                <w:strike w:val="false"/>
+                <w:sz w:val="24"/>
+                <w:szCs w:val="24"/>
                 <w:color w:val="000000"/>
               </w:rPr>
             </w:pPr>
@@ -1727,473 +2407,11 @@
                 <w:b w:val="false"/>
                 <w:u w:val="none"/>
                 <w:strike w:val="false"/>
-                <w:sz w:val="20"/>
-                <w:szCs w:val="20"/>
-                <w:color w:val="000000"/>
-              </w:rPr>
-              <w:t xml:space="preserve">2,886 businesses:  1,411 → 742</w:t>
-            </w:r>
-          </w:p>
-        </w:tc>
-        <w:tc>
-          <w:tcPr>
-            <w:tcBorders>
-              <w:bottom w:val="single" w:sz="6" w:space="0" w:color="9AA8B8"/>
-              <w:top w:val="single" w:sz="6" w:space="0" w:color="9AA8B8"/>
-              <w:left w:val="none" w:sz="0" w:space="0" w:color="000000"/>
-              <w:right w:val="none" w:sz="0" w:space="0" w:color="000000"/>
-            </w:tcBorders>
-            <w:shd w:val="clear" w:color="auto" w:fill="FFFFFF"/>
-            <w:tcMar>
-              <w:top w:w="0" w:type="dxa"/>
-              <w:bottom w:w="0" w:type="dxa"/>
-              <w:left w:w="0" w:type="dxa"/>
-              <w:right w:w="0" w:type="dxa"/>
-            </w:tcMar>
-            <w:vAlign w:val="top"/>
-          </w:tcPr>
-          <w:p>
-            <w:pPr>
-              <w:jc w:val="left"/>
-              <w:pBdr>
-                <w:bottom w:val="none" w:sz="0" w:space="0" w:color="000000"/>
-                <w:top w:val="none" w:sz="0" w:space="0" w:color="000000"/>
-                <w:left w:val="none" w:sz="0" w:space="0" w:color="000000"/>
-                <w:right w:val="none" w:sz="0" w:space="0" w:color="000000"/>
-              </w:pBdr>
-              <w:spacing w:after="80" w:before="80" w:line="240"/>
-              <w:ind w:left="80" w:right="80" w:firstLine="0" w:firstLineChars="0"/>
-              <w:rPr>
-                <w:rFonts w:ascii="Arial" w:hAnsi="Arial" w:eastAsia="Arial" w:cs="Arial"/>
-                <w:i w:val="false"/>
-                <w:b w:val="false"/>
-                <w:u w:val="none"/>
-                <w:strike w:val="false"/>
-                <w:sz w:val="20"/>
-                <w:szCs w:val="20"/>
-                <w:color w:val="000000"/>
-              </w:rPr>
-            </w:pPr>
-            <w:r>
-              <w:rPr>
-                <w:rFonts w:ascii="Arial" w:hAnsi="Arial" w:eastAsia="Arial" w:cs="Arial"/>
-                <w:i w:val="false"/>
-                <w:b w:val="false"/>
-                <w:u w:val="none"/>
-                <w:strike w:val="false"/>
-                <w:sz w:val="20"/>
-                <w:szCs w:val="20"/>
-                <w:color w:val="000000"/>
-              </w:rPr>
-              <w:t xml:space="preserve">3,114 businesses:  2,097 → 2,245</w:t>
-            </w:r>
-          </w:p>
-        </w:tc>
-      </w:tr>
-    </w:tbl>
-    <w:p>
-      <w:pPr>
-        <w:pStyle w:val="Normal"/>
-        <w:jc w:val="left"/>
-        <w:pBdr>
-          <w:bottom w:val="none" w:sz="0" w:space="0" w:color="000000"/>
-          <w:top w:val="none" w:sz="0" w:space="0" w:color="000000"/>
-          <w:left w:val="none" w:sz="0" w:space="0" w:color="000000"/>
-          <w:right w:val="none" w:sz="0" w:space="0" w:color="000000"/>
-        </w:pBdr>
-        <w:spacing w:after="160" w:before="0" w:line="240"/>
-        <w:ind w:left="0" w:right="0" w:firstLine="0" w:firstLineChars="0"/>
-      </w:pPr>
-      <w:r>
-        <w:rPr>
-          <w:rFonts w:ascii="Arial" w:hAnsi="Arial" w:eastAsia="Arial" w:cs="Arial"/>
-          <w:i w:val="true"/>
-          <w:b w:val="false"/>
-          <w:u w:val="none"/>
-          <w:strike w:val="false"/>
-          <w:sz w:val="20"/>
-          <w:szCs w:val="20"/>
-          <w:color w:val="000000"/>
-        </w:rPr>
-        <w:t xml:space="preserve">Every method this week compares the businesses that took part with one of the other groups. The question each session asks: compared with whom, and is that a fair comparison?</w:t>
-      </w:r>
-    </w:p>
-    <w:p>
-      <w:pPr>
-        <w:pStyle w:val="Normal"/>
-        <w:jc w:val="left"/>
-        <w:pBdr>
-          <w:bottom w:val="none" w:sz="0" w:space="0" w:color="000000"/>
-          <w:top w:val="none" w:sz="0" w:space="0" w:color="000000"/>
-          <w:left w:val="none" w:sz="0" w:space="0" w:color="000000"/>
-          <w:right w:val="none" w:sz="0" w:space="0" w:color="000000"/>
-        </w:pBdr>
-        <w:spacing w:after="60" w:before="0" w:line="240"/>
-        <w:ind w:left="0" w:right="0" w:firstLine="0" w:firstLineChars="0"/>
-      </w:pPr>
-      <w:r>
-        <w:rPr>
-          <w:rFonts w:ascii="Arial" w:hAnsi="Arial" w:eastAsia="Arial" w:cs="Arial"/>
-          <w:i w:val="false"/>
-          <w:b w:val="true"/>
-          <w:u w:val="none"/>
-          <w:strike w:val="false"/>
-          <w:sz w:val="25"/>
-          <w:szCs w:val="25"/>
-          <w:color w:val="215A9E"/>
-        </w:rPr>
-        <w:t xml:space="preserve">The data: one row per business</w:t>
-      </w:r>
-    </w:p>
-    <w:tbl xmlns:a="http://schemas.openxmlformats.org/drawingml/2006/main" xmlns:pic="http://schemas.openxmlformats.org/drawingml/2006/picture">
-      <w:tblPr>
-        <w:tblLayout w:type="fixed"/>
-        <w:jc w:val="center"/>
-        <w:tblLook w:firstRow="1" w:lastRow="0" w:firstColumn="0" w:lastColumn="0" w:noHBand="0" w:noVBand="1"/>
-      </w:tblPr>
-      <w:tblGrid>
-        <w:gridCol w:w="3168"/>
-        <w:gridCol w:w="6768"/>
-      </w:tblGrid>
-      <w:tr>
-        <w:trPr>
-          <w:trHeight w:val="360" w:hRule="auto"/>
-          <w:tblHeader/>
-        </w:trPr>
-        header1
-        <w:tc>
-          <w:tcPr>
-            <w:tcBorders>
-              <w:bottom w:val="none" w:sz="0" w:space="0" w:color="000000"/>
-              <w:top w:val="single" w:sz="10" w:space="0" w:color="063360"/>
-              <w:left w:val="none" w:sz="0" w:space="0" w:color="000000"/>
-              <w:right w:val="none" w:sz="0" w:space="0" w:color="000000"/>
-            </w:tcBorders>
-            <w:shd w:val="clear" w:color="auto" w:fill="E3EBF5"/>
-            <w:tcMar>
-              <w:top w:w="0" w:type="dxa"/>
-              <w:bottom w:w="0" w:type="dxa"/>
-              <w:left w:w="0" w:type="dxa"/>
-              <w:right w:w="0" w:type="dxa"/>
-            </w:tcMar>
-            <w:vAlign w:val="top"/>
-          </w:tcPr>
-          <w:p>
-            <w:pPr>
-              <w:jc w:val="left"/>
-              <w:pBdr>
-                <w:bottom w:val="none" w:sz="0" w:space="0" w:color="000000"/>
-                <w:top w:val="none" w:sz="0" w:space="0" w:color="000000"/>
-                <w:left w:val="none" w:sz="0" w:space="0" w:color="000000"/>
-                <w:right w:val="none" w:sz="0" w:space="0" w:color="000000"/>
-              </w:pBdr>
-              <w:spacing w:after="80" w:before="80" w:line="240"/>
-              <w:ind w:left="80" w:right="80" w:firstLine="0" w:firstLineChars="0"/>
-              <w:rPr>
-                <w:rFonts w:ascii="Arial" w:hAnsi="Arial" w:eastAsia="Arial" w:cs="Arial"/>
-                <w:i w:val="false"/>
-                <w:b w:val="true"/>
-                <w:u w:val="none"/>
-                <w:strike w:val="false"/>
-                <w:sz w:val="20"/>
-                <w:szCs w:val="20"/>
-                <w:color w:val="063360"/>
-              </w:rPr>
-            </w:pPr>
-            <w:r>
-              <w:rPr>
-                <w:rFonts w:ascii="Arial" w:hAnsi="Arial" w:eastAsia="Arial" w:cs="Arial"/>
-                <w:i w:val="false"/>
-                <w:b w:val="true"/>
-                <w:u w:val="none"/>
-                <w:strike w:val="false"/>
-                <w:sz w:val="20"/>
-                <w:szCs w:val="20"/>
-                <w:color w:val="063360"/>
-              </w:rPr>
-              <w:t xml:space="preserve">Column</w:t>
-            </w:r>
-          </w:p>
-        </w:tc>
-        <w:tc>
-          <w:tcPr>
-            <w:tcBorders>
-              <w:bottom w:val="none" w:sz="0" w:space="0" w:color="000000"/>
-              <w:top w:val="single" w:sz="10" w:space="0" w:color="063360"/>
-              <w:left w:val="none" w:sz="0" w:space="0" w:color="000000"/>
-              <w:right w:val="none" w:sz="0" w:space="0" w:color="000000"/>
-            </w:tcBorders>
-            <w:shd w:val="clear" w:color="auto" w:fill="E3EBF5"/>
-            <w:tcMar>
-              <w:top w:w="0" w:type="dxa"/>
-              <w:bottom w:w="0" w:type="dxa"/>
-              <w:left w:w="0" w:type="dxa"/>
-              <w:right w:w="0" w:type="dxa"/>
-            </w:tcMar>
-            <w:vAlign w:val="top"/>
-          </w:tcPr>
-          <w:p>
-            <w:pPr>
-              <w:jc w:val="left"/>
-              <w:pBdr>
-                <w:bottom w:val="none" w:sz="0" w:space="0" w:color="000000"/>
-                <w:top w:val="none" w:sz="0" w:space="0" w:color="000000"/>
-                <w:left w:val="none" w:sz="0" w:space="0" w:color="000000"/>
-                <w:right w:val="none" w:sz="0" w:space="0" w:color="000000"/>
-              </w:pBdr>
-              <w:spacing w:after="80" w:before="80" w:line="240"/>
-              <w:ind w:left="80" w:right="80" w:firstLine="0" w:firstLineChars="0"/>
-              <w:rPr>
-                <w:rFonts w:ascii="Arial" w:hAnsi="Arial" w:eastAsia="Arial" w:cs="Arial"/>
-                <w:i w:val="false"/>
-                <w:b w:val="true"/>
-                <w:u w:val="none"/>
-                <w:strike w:val="false"/>
-                <w:sz w:val="20"/>
-                <w:szCs w:val="20"/>
-                <w:color w:val="063360"/>
-              </w:rPr>
-            </w:pPr>
-            <w:r>
-              <w:rPr>
-                <w:rFonts w:ascii="Arial" w:hAnsi="Arial" w:eastAsia="Arial" w:cs="Arial"/>
-                <w:i w:val="false"/>
-                <w:b w:val="true"/>
-                <w:u w:val="none"/>
-                <w:strike w:val="false"/>
-                <w:sz w:val="20"/>
-                <w:szCs w:val="20"/>
-                <w:color w:val="063360"/>
-              </w:rPr>
-              <w:t xml:space="preserve">Meaning</w:t>
-            </w:r>
-          </w:p>
-        </w:tc>
-      </w:tr>
-      <w:tr>
-        <w:trPr>
-          <w:trHeight w:val="360" w:hRule="auto"/>
-        </w:trPr>
-        body1
-        <w:tc>
-          <w:tcPr>
-            <w:tcBorders>
-              <w:bottom w:val="single" w:sz="6" w:space="0" w:color="9AA8B8"/>
-              <w:top w:val="none" w:sz="0" w:space="0" w:color="000000"/>
-              <w:left w:val="none" w:sz="0" w:space="0" w:color="000000"/>
-              <w:right w:val="none" w:sz="0" w:space="0" w:color="000000"/>
-            </w:tcBorders>
-            <w:shd w:val="clear" w:color="auto" w:fill="FFFFFF"/>
-            <w:tcMar>
-              <w:top w:w="0" w:type="dxa"/>
-              <w:bottom w:w="0" w:type="dxa"/>
-              <w:left w:w="0" w:type="dxa"/>
-              <w:right w:w="0" w:type="dxa"/>
-            </w:tcMar>
-            <w:vAlign w:val="top"/>
-          </w:tcPr>
-          <w:p>
-            <w:pPr>
-              <w:jc w:val="left"/>
-              <w:pBdr>
-                <w:bottom w:val="none" w:sz="0" w:space="0" w:color="000000"/>
-                <w:top w:val="none" w:sz="0" w:space="0" w:color="000000"/>
-                <w:left w:val="none" w:sz="0" w:space="0" w:color="000000"/>
-                <w:right w:val="none" w:sz="0" w:space="0" w:color="000000"/>
-              </w:pBdr>
-              <w:spacing w:after="80" w:before="80" w:line="240"/>
-              <w:ind w:left="80" w:right="80" w:firstLine="0" w:firstLineChars="0"/>
-              <w:rPr>
-                <w:rFonts w:ascii="Consolas" w:hAnsi="Consolas" w:eastAsia="Consolas" w:cs="Consolas"/>
-                <w:i w:val="false"/>
-                <w:b w:val="true"/>
-                <w:u w:val="none"/>
-                <w:strike w:val="false"/>
-                <w:sz w:val="20"/>
-                <w:szCs w:val="20"/>
-                <w:color w:val="000000"/>
-              </w:rPr>
-            </w:pPr>
-            <w:r>
-              <w:rPr>
-                <w:rFonts w:ascii="Consolas" w:hAnsi="Consolas" w:eastAsia="Consolas" w:cs="Consolas"/>
-                <w:i w:val="false"/>
-                <w:b w:val="true"/>
-                <w:u w:val="none"/>
-                <w:strike w:val="false"/>
-                <w:sz w:val="20"/>
-                <w:szCs w:val="20"/>
-                <w:color w:val="000000"/>
-              </w:rPr>
-              <w:t xml:space="preserve">business</w:t>
-            </w:r>
-          </w:p>
-        </w:tc>
-        <w:tc>
-          <w:tcPr>
-            <w:tcBorders>
-              <w:bottom w:val="single" w:sz="6" w:space="0" w:color="9AA8B8"/>
-              <w:top w:val="none" w:sz="0" w:space="0" w:color="000000"/>
-              <w:left w:val="none" w:sz="0" w:space="0" w:color="000000"/>
-              <w:right w:val="none" w:sz="0" w:space="0" w:color="000000"/>
-            </w:tcBorders>
-            <w:shd w:val="clear" w:color="auto" w:fill="FFFFFF"/>
-            <w:tcMar>
-              <w:top w:w="0" w:type="dxa"/>
-              <w:bottom w:w="0" w:type="dxa"/>
-              <w:left w:w="0" w:type="dxa"/>
-              <w:right w:w="0" w:type="dxa"/>
-            </w:tcMar>
-            <w:vAlign w:val="top"/>
-          </w:tcPr>
-          <w:p>
-            <w:pPr>
-              <w:jc w:val="left"/>
-              <w:pBdr>
-                <w:bottom w:val="none" w:sz="0" w:space="0" w:color="000000"/>
-                <w:top w:val="none" w:sz="0" w:space="0" w:color="000000"/>
-                <w:left w:val="none" w:sz="0" w:space="0" w:color="000000"/>
-                <w:right w:val="none" w:sz="0" w:space="0" w:color="000000"/>
-              </w:pBdr>
-              <w:spacing w:after="80" w:before="80" w:line="240"/>
-              <w:ind w:left="80" w:right="80" w:firstLine="0" w:firstLineChars="0"/>
-              <w:rPr>
-                <w:rFonts w:ascii="Arial" w:hAnsi="Arial" w:eastAsia="Arial" w:cs="Arial"/>
-                <w:i w:val="false"/>
-                <w:b w:val="false"/>
-                <w:u w:val="none"/>
-                <w:strike w:val="false"/>
-                <w:sz w:val="20"/>
-                <w:szCs w:val="20"/>
-                <w:color w:val="000000"/>
-              </w:rPr>
-            </w:pPr>
-            <w:r>
-              <w:rPr>
-                <w:rFonts w:ascii="Arial" w:hAnsi="Arial" w:eastAsia="Arial" w:cs="Arial"/>
-                <w:i w:val="false"/>
-                <w:b w:val="false"/>
-                <w:u w:val="none"/>
-                <w:strike w:val="false"/>
-                <w:sz w:val="20"/>
-                <w:szCs w:val="20"/>
-                <w:color w:val="000000"/>
-              </w:rPr>
-              <w:t xml:space="preserve">an identifier</w:t>
-            </w:r>
-          </w:p>
-        </w:tc>
-      </w:tr>
-      <w:tr>
-        <w:trPr>
-          <w:trHeight w:val="360" w:hRule="auto"/>
-        </w:trPr>
-        body2
-        <w:tc>
-          <w:tcPr>
-            <w:tcBorders>
-              <w:bottom w:val="single" w:sz="6" w:space="0" w:color="9AA8B8"/>
-              <w:top w:val="single" w:sz="6" w:space="0" w:color="9AA8B8"/>
-              <w:left w:val="none" w:sz="0" w:space="0" w:color="000000"/>
-              <w:right w:val="none" w:sz="0" w:space="0" w:color="000000"/>
-            </w:tcBorders>
-            <w:shd w:val="clear" w:color="auto" w:fill="FFFFFF"/>
-            <w:tcMar>
-              <w:top w:w="0" w:type="dxa"/>
-              <w:bottom w:w="0" w:type="dxa"/>
-              <w:left w:w="0" w:type="dxa"/>
-              <w:right w:w="0" w:type="dxa"/>
-            </w:tcMar>
-            <w:vAlign w:val="top"/>
-          </w:tcPr>
-          <w:p>
-            <w:pPr>
-              <w:jc w:val="left"/>
-              <w:pBdr>
-                <w:bottom w:val="none" w:sz="0" w:space="0" w:color="000000"/>
-                <w:top w:val="none" w:sz="0" w:space="0" w:color="000000"/>
-                <w:left w:val="none" w:sz="0" w:space="0" w:color="000000"/>
-                <w:right w:val="none" w:sz="0" w:space="0" w:color="000000"/>
-              </w:pBdr>
-              <w:spacing w:after="80" w:before="80" w:line="240"/>
-              <w:ind w:left="80" w:right="80" w:firstLine="0" w:firstLineChars="0"/>
-              <w:rPr>
-                <w:rFonts w:ascii="Consolas" w:hAnsi="Consolas" w:eastAsia="Consolas" w:cs="Consolas"/>
-                <w:i w:val="false"/>
-                <w:b w:val="true"/>
-                <w:u w:val="none"/>
-                <w:strike w:val="false"/>
-                <w:sz w:val="20"/>
-                <w:szCs w:val="20"/>
-                <w:color w:val="000000"/>
-              </w:rPr>
-            </w:pPr>
-            <w:r>
-              <w:rPr>
-                <w:rFonts w:ascii="Consolas" w:hAnsi="Consolas" w:eastAsia="Consolas" w:cs="Consolas"/>
-                <w:i w:val="false"/>
-                <w:b w:val="true"/>
-                <w:u w:val="none"/>
-                <w:strike w:val="false"/>
-                <w:sz w:val="20"/>
-                <w:szCs w:val="20"/>
-                <w:color w:val="000000"/>
-              </w:rPr>
-              <w:t xml:space="preserve">setting</w:t>
-            </w:r>
-          </w:p>
-        </w:tc>
-        <w:tc>
-          <w:tcPr>
-            <w:tcBorders>
-              <w:bottom w:val="single" w:sz="6" w:space="0" w:color="9AA8B8"/>
-              <w:top w:val="single" w:sz="6" w:space="0" w:color="9AA8B8"/>
-              <w:left w:val="none" w:sz="0" w:space="0" w:color="000000"/>
-              <w:right w:val="none" w:sz="0" w:space="0" w:color="000000"/>
-            </w:tcBorders>
-            <w:shd w:val="clear" w:color="auto" w:fill="FFFFFF"/>
-            <w:tcMar>
-              <w:top w:w="0" w:type="dxa"/>
-              <w:bottom w:w="0" w:type="dxa"/>
-              <w:left w:w="0" w:type="dxa"/>
-              <w:right w:w="0" w:type="dxa"/>
-            </w:tcMar>
-            <w:vAlign w:val="top"/>
-          </w:tcPr>
-          <w:p>
-            <w:pPr>
-              <w:jc w:val="left"/>
-              <w:pBdr>
-                <w:bottom w:val="none" w:sz="0" w:space="0" w:color="000000"/>
-                <w:top w:val="none" w:sz="0" w:space="0" w:color="000000"/>
-                <w:left w:val="none" w:sz="0" w:space="0" w:color="000000"/>
-                <w:right w:val="none" w:sz="0" w:space="0" w:color="000000"/>
-              </w:pBdr>
-              <w:spacing w:after="80" w:before="80" w:line="240"/>
-              <w:ind w:left="80" w:right="80" w:firstLine="0" w:firstLineChars="0"/>
-              <w:rPr>
-                <w:rFonts w:ascii="Arial" w:hAnsi="Arial" w:eastAsia="Arial" w:cs="Arial"/>
-                <w:i w:val="false"/>
-                <w:b w:val="false"/>
-                <w:u w:val="none"/>
-                <w:strike w:val="false"/>
-                <w:sz w:val="20"/>
-                <w:szCs w:val="20"/>
-                <w:color w:val="000000"/>
-              </w:rPr>
-            </w:pPr>
-            <w:r>
-              <w:rPr>
-                <w:rFonts w:ascii="Arial" w:hAnsi="Arial" w:eastAsia="Arial" w:cs="Arial"/>
-                <w:i w:val="false"/>
-                <w:b w:val="false"/>
-                <w:u w:val="none"/>
-                <w:strike w:val="false"/>
-                <w:sz w:val="20"/>
-                <w:szCs w:val="20"/>
-                <w:color w:val="000000"/>
-              </w:rPr>
-              <w:t xml:space="preserve">pilot (the lottery) or city (the rule)</w:t>
+                <w:sz w:val="24"/>
+                <w:szCs w:val="24"/>
+                <w:color w:val="000000"/>
+              </w:rPr>
+              <w:t xml:space="preserve">Efficiency score; 1 if joined, 0 otherwise</w:t>
             </w:r>
           </w:p>
         </w:tc>
@@ -2206,10 +2424,10 @@
         <w:tc>
           <w:tcPr>
             <w:tcBorders>
-              <w:bottom w:val="single" w:sz="6" w:space="0" w:color="9AA8B8"/>
-              <w:top w:val="single" w:sz="6" w:space="0" w:color="9AA8B8"/>
-              <w:left w:val="none" w:sz="0" w:space="0" w:color="000000"/>
-              <w:right w:val="none" w:sz="0" w:space="0" w:color="000000"/>
+              <w:bottom w:val="single" w:sz="6" w:space="0" w:color="D9D9D9"/>
+              <w:top w:val="single" w:sz="6" w:space="0" w:color="D9D9D9"/>
+              <w:left w:val="single" w:sz="6" w:space="0" w:color="D9D9D9"/>
+              <w:right w:val="single" w:sz="6" w:space="0" w:color="D9D9D9"/>
             </w:tcBorders>
             <w:shd w:val="clear" w:color="auto" w:fill="FFFFFF"/>
             <w:tcMar>
@@ -2218,7 +2436,7 @@
               <w:left w:w="0" w:type="dxa"/>
               <w:right w:w="0" w:type="dxa"/>
             </w:tcMar>
-            <w:vAlign w:val="top"/>
+            <w:vAlign w:val="center"/>
           </w:tcPr>
           <w:p>
             <w:pPr>
@@ -2229,41 +2447,67 @@
                 <w:left w:val="none" w:sz="0" w:space="0" w:color="000000"/>
                 <w:right w:val="none" w:sz="0" w:space="0" w:color="000000"/>
               </w:pBdr>
-              <w:spacing w:after="80" w:before="80" w:line="240"/>
-              <w:ind w:left="80" w:right="80" w:firstLine="0" w:firstLineChars="0"/>
-              <w:rPr>
-                <w:rFonts w:ascii="Consolas" w:hAnsi="Consolas" w:eastAsia="Consolas" w:cs="Consolas"/>
-                <w:i w:val="false"/>
-                <w:b w:val="true"/>
-                <w:u w:val="none"/>
-                <w:strike w:val="false"/>
-                <w:sz w:val="20"/>
-                <w:szCs w:val="20"/>
+              <w:spacing w:after="140" w:before="140" w:line="240"/>
+              <w:ind w:left="140" w:right="140" w:firstLine="0" w:firstLineChars="0"/>
+              <w:rPr>
+                <w:rFonts w:ascii="Arial" w:hAnsi="Arial" w:eastAsia="Arial" w:cs="Arial"/>
+                <w:i w:val="false"/>
+                <w:b w:val="false"/>
+                <w:u w:val="none"/>
+                <w:strike w:val="false"/>
+                <w:sz w:val="24"/>
+                <w:szCs w:val="24"/>
                 <w:color w:val="000000"/>
               </w:rPr>
             </w:pPr>
             <w:r>
               <w:rPr>
-                <w:rFonts w:ascii="Consolas" w:hAnsi="Consolas" w:eastAsia="Consolas" w:cs="Consolas"/>
-                <w:i w:val="false"/>
-                <w:b w:val="true"/>
-                <w:u w:val="none"/>
-                <w:strike w:val="false"/>
-                <w:sz w:val="20"/>
-                <w:szCs w:val="20"/>
-                <w:color w:val="000000"/>
-              </w:rPr>
-              <w:t xml:space="preserve">score</w:t>
+                <w:rFonts w:ascii="Arial" w:hAnsi="Arial" w:eastAsia="Arial" w:cs="Arial"/>
+                <w:i w:val="false"/>
+                <w:b w:val="false"/>
+                <w:u w:val="none"/>
+                <w:strike w:val="false"/>
+                <w:sz w:val="24"/>
+                <w:szCs w:val="24"/>
+                <w:color w:val="000000"/>
+              </w:rPr>
+              <w:t xml:space="preserve">cost_before</w:t>
+            </w:r>
+            <w:r>
+              <w:rPr>
+                <w:rFonts w:ascii="Arial" w:hAnsi="Arial" w:eastAsia="Arial" w:cs="Arial"/>
+                <w:i w:val="false"/>
+                <w:b w:val="false"/>
+                <w:u w:val="none"/>
+                <w:strike w:val="false"/>
+                <w:sz w:val="24"/>
+                <w:szCs w:val="24"/>
+                <w:color w:val="000000"/>
+              </w:rPr>
+              <w:br/>
+            </w:r>
+            <w:r>
+              <w:rPr>
+                <w:rFonts w:ascii="Arial" w:hAnsi="Arial" w:eastAsia="Arial" w:cs="Arial"/>
+                <w:i w:val="false"/>
+                <w:b w:val="false"/>
+                <w:u w:val="none"/>
+                <w:strike w:val="false"/>
+                <w:sz w:val="24"/>
+                <w:szCs w:val="24"/>
+                <w:color w:val="000000"/>
+              </w:rPr>
+              <w:t xml:space="preserve">cost_after</w:t>
             </w:r>
           </w:p>
         </w:tc>
         <w:tc>
           <w:tcPr>
             <w:tcBorders>
-              <w:bottom w:val="single" w:sz="6" w:space="0" w:color="9AA8B8"/>
-              <w:top w:val="single" w:sz="6" w:space="0" w:color="9AA8B8"/>
-              <w:left w:val="none" w:sz="0" w:space="0" w:color="000000"/>
-              <w:right w:val="none" w:sz="0" w:space="0" w:color="000000"/>
+              <w:bottom w:val="single" w:sz="6" w:space="0" w:color="D9D9D9"/>
+              <w:top w:val="single" w:sz="6" w:space="0" w:color="D9D9D9"/>
+              <w:left w:val="single" w:sz="6" w:space="0" w:color="D9D9D9"/>
+              <w:right w:val="single" w:sz="6" w:space="0" w:color="D9D9D9"/>
             </w:tcBorders>
             <w:shd w:val="clear" w:color="auto" w:fill="FFFFFF"/>
             <w:tcMar>
@@ -2272,7 +2516,7 @@
               <w:left w:w="0" w:type="dxa"/>
               <w:right w:w="0" w:type="dxa"/>
             </w:tcMar>
-            <w:vAlign w:val="top"/>
+            <w:vAlign w:val="center"/>
           </w:tcPr>
           <w:p>
             <w:pPr>
@@ -2283,16 +2527,16 @@
                 <w:left w:val="none" w:sz="0" w:space="0" w:color="000000"/>
                 <w:right w:val="none" w:sz="0" w:space="0" w:color="000000"/>
               </w:pBdr>
-              <w:spacing w:after="80" w:before="80" w:line="240"/>
-              <w:ind w:left="80" w:right="80" w:firstLine="0" w:firstLineChars="0"/>
-              <w:rPr>
-                <w:rFonts w:ascii="Arial" w:hAnsi="Arial" w:eastAsia="Arial" w:cs="Arial"/>
-                <w:i w:val="false"/>
-                <w:b w:val="false"/>
-                <w:u w:val="none"/>
-                <w:strike w:val="false"/>
-                <w:sz w:val="20"/>
-                <w:szCs w:val="20"/>
+              <w:spacing w:after="140" w:before="140" w:line="240"/>
+              <w:ind w:left="140" w:right="140" w:firstLine="0" w:firstLineChars="0"/>
+              <w:rPr>
+                <w:rFonts w:ascii="Arial" w:hAnsi="Arial" w:eastAsia="Arial" w:cs="Arial"/>
+                <w:i w:val="false"/>
+                <w:b w:val="false"/>
+                <w:u w:val="none"/>
+                <w:strike w:val="false"/>
+                <w:sz w:val="24"/>
+                <w:szCs w:val="24"/>
                 <w:color w:val="000000"/>
               </w:rPr>
             </w:pPr>
@@ -2303,11 +2547,11 @@
                 <w:b w:val="false"/>
                 <w:u w:val="none"/>
                 <w:strike w:val="false"/>
-                <w:sz w:val="20"/>
-                <w:szCs w:val="20"/>
-                <w:color w:val="000000"/>
-              </w:rPr>
-              <w:t xml:space="preserve">efficiency score, 0 to 100</w:t>
+                <w:sz w:val="24"/>
+                <w:szCs w:val="24"/>
+                <w:color w:val="000000"/>
+              </w:rPr>
+              <w:t xml:space="preserve">Annual waste cost in AED, before and after</w:t>
             </w:r>
           </w:p>
         </w:tc>
@@ -2320,19 +2564,19 @@
         <w:tc>
           <w:tcPr>
             <w:tcBorders>
-              <w:bottom w:val="single" w:sz="6" w:space="0" w:color="9AA8B8"/>
-              <w:top w:val="single" w:sz="6" w:space="0" w:color="9AA8B8"/>
-              <w:left w:val="none" w:sz="0" w:space="0" w:color="000000"/>
-              <w:right w:val="none" w:sz="0" w:space="0" w:color="000000"/>
+              <w:bottom w:val="single" w:sz="6" w:space="0" w:color="D9D9D9"/>
+              <w:top w:val="single" w:sz="6" w:space="0" w:color="D9D9D9"/>
+              <w:left w:val="single" w:sz="6" w:space="0" w:color="D9D9D9"/>
+              <w:right w:val="single" w:sz="6" w:space="0" w:color="D9D9D9"/>
             </w:tcBorders>
-            <w:shd w:val="clear" w:color="auto" w:fill="FFFFFF"/>
+            <w:shd w:val="clear" w:color="auto" w:fill="F1F5F9"/>
             <w:tcMar>
               <w:top w:w="0" w:type="dxa"/>
               <w:bottom w:w="0" w:type="dxa"/>
               <w:left w:w="0" w:type="dxa"/>
               <w:right w:w="0" w:type="dxa"/>
             </w:tcMar>
-            <w:vAlign w:val="top"/>
+            <w:vAlign w:val="center"/>
           </w:tcPr>
           <w:p>
             <w:pPr>
@@ -2343,50 +2587,76 @@
                 <w:left w:val="none" w:sz="0" w:space="0" w:color="000000"/>
                 <w:right w:val="none" w:sz="0" w:space="0" w:color="000000"/>
               </w:pBdr>
-              <w:spacing w:after="80" w:before="80" w:line="240"/>
-              <w:ind w:left="80" w:right="80" w:firstLine="0" w:firstLineChars="0"/>
-              <w:rPr>
-                <w:rFonts w:ascii="Consolas" w:hAnsi="Consolas" w:eastAsia="Consolas" w:cs="Consolas"/>
-                <w:i w:val="false"/>
-                <w:b w:val="true"/>
-                <w:u w:val="none"/>
-                <w:strike w:val="false"/>
-                <w:sz w:val="20"/>
-                <w:szCs w:val="20"/>
+              <w:spacing w:after="140" w:before="140" w:line="240"/>
+              <w:ind w:left="140" w:right="140" w:firstLine="0" w:firstLineChars="0"/>
+              <w:rPr>
+                <w:rFonts w:ascii="Arial" w:hAnsi="Arial" w:eastAsia="Arial" w:cs="Arial"/>
+                <w:i w:val="false"/>
+                <w:b w:val="false"/>
+                <w:u w:val="none"/>
+                <w:strike w:val="false"/>
+                <w:sz w:val="24"/>
+                <w:szCs w:val="24"/>
                 <w:color w:val="000000"/>
               </w:rPr>
             </w:pPr>
             <w:r>
               <w:rPr>
-                <w:rFonts w:ascii="Consolas" w:hAnsi="Consolas" w:eastAsia="Consolas" w:cs="Consolas"/>
-                <w:i w:val="false"/>
-                <w:b w:val="true"/>
-                <w:u w:val="none"/>
-                <w:strike w:val="false"/>
-                <w:sz w:val="20"/>
-                <w:szCs w:val="20"/>
-                <w:color w:val="000000"/>
-              </w:rPr>
-              <w:t xml:space="preserve">took_part</w:t>
+                <w:rFonts w:ascii="Arial" w:hAnsi="Arial" w:eastAsia="Arial" w:cs="Arial"/>
+                <w:i w:val="false"/>
+                <w:b w:val="false"/>
+                <w:u w:val="none"/>
+                <w:strike w:val="false"/>
+                <w:sz w:val="24"/>
+                <w:szCs w:val="24"/>
+                <w:color w:val="000000"/>
+              </w:rPr>
+              <w:t xml:space="preserve">landfill_before</w:t>
+            </w:r>
+            <w:r>
+              <w:rPr>
+                <w:rFonts w:ascii="Arial" w:hAnsi="Arial" w:eastAsia="Arial" w:cs="Arial"/>
+                <w:i w:val="false"/>
+                <w:b w:val="false"/>
+                <w:u w:val="none"/>
+                <w:strike w:val="false"/>
+                <w:sz w:val="24"/>
+                <w:szCs w:val="24"/>
+                <w:color w:val="000000"/>
+              </w:rPr>
+              <w:br/>
+            </w:r>
+            <w:r>
+              <w:rPr>
+                <w:rFonts w:ascii="Arial" w:hAnsi="Arial" w:eastAsia="Arial" w:cs="Arial"/>
+                <w:i w:val="false"/>
+                <w:b w:val="false"/>
+                <w:u w:val="none"/>
+                <w:strike w:val="false"/>
+                <w:sz w:val="24"/>
+                <w:szCs w:val="24"/>
+                <w:color w:val="000000"/>
+              </w:rPr>
+              <w:t xml:space="preserve">landfill_after</w:t>
             </w:r>
           </w:p>
         </w:tc>
         <w:tc>
           <w:tcPr>
             <w:tcBorders>
-              <w:bottom w:val="single" w:sz="6" w:space="0" w:color="9AA8B8"/>
-              <w:top w:val="single" w:sz="6" w:space="0" w:color="9AA8B8"/>
-              <w:left w:val="none" w:sz="0" w:space="0" w:color="000000"/>
-              <w:right w:val="none" w:sz="0" w:space="0" w:color="000000"/>
+              <w:bottom w:val="single" w:sz="6" w:space="0" w:color="D9D9D9"/>
+              <w:top w:val="single" w:sz="6" w:space="0" w:color="D9D9D9"/>
+              <w:left w:val="single" w:sz="6" w:space="0" w:color="D9D9D9"/>
+              <w:right w:val="single" w:sz="6" w:space="0" w:color="D9D9D9"/>
             </w:tcBorders>
-            <w:shd w:val="clear" w:color="auto" w:fill="FFFFFF"/>
+            <w:shd w:val="clear" w:color="auto" w:fill="F1F5F9"/>
             <w:tcMar>
               <w:top w:w="0" w:type="dxa"/>
               <w:bottom w:w="0" w:type="dxa"/>
               <w:left w:w="0" w:type="dxa"/>
               <w:right w:w="0" w:type="dxa"/>
             </w:tcMar>
-            <w:vAlign w:val="top"/>
+            <w:vAlign w:val="center"/>
           </w:tcPr>
           <w:p>
             <w:pPr>
@@ -2397,16 +2667,16 @@
                 <w:left w:val="none" w:sz="0" w:space="0" w:color="000000"/>
                 <w:right w:val="none" w:sz="0" w:space="0" w:color="000000"/>
               </w:pBdr>
-              <w:spacing w:after="80" w:before="80" w:line="240"/>
-              <w:ind w:left="80" w:right="80" w:firstLine="0" w:firstLineChars="0"/>
-              <w:rPr>
-                <w:rFonts w:ascii="Arial" w:hAnsi="Arial" w:eastAsia="Arial" w:cs="Arial"/>
-                <w:i w:val="false"/>
-                <w:b w:val="false"/>
-                <w:u w:val="none"/>
-                <w:strike w:val="false"/>
-                <w:sz w:val="20"/>
-                <w:szCs w:val="20"/>
+              <w:spacing w:after="140" w:before="140" w:line="240"/>
+              <w:ind w:left="140" w:right="140" w:firstLine="0" w:firstLineChars="0"/>
+              <w:rPr>
+                <w:rFonts w:ascii="Arial" w:hAnsi="Arial" w:eastAsia="Arial" w:cs="Arial"/>
+                <w:i w:val="false"/>
+                <w:b w:val="false"/>
+                <w:u w:val="none"/>
+                <w:strike w:val="false"/>
+                <w:sz w:val="24"/>
+                <w:szCs w:val="24"/>
                 <w:color w:val="000000"/>
               </w:rPr>
             </w:pPr>
@@ -2417,11 +2687,11 @@
                 <w:b w:val="false"/>
                 <w:u w:val="none"/>
                 <w:strike w:val="false"/>
-                <w:sz w:val="20"/>
-                <w:szCs w:val="20"/>
-                <w:color w:val="000000"/>
-              </w:rPr>
-              <w:t xml:space="preserve">1 if the business took part in GreenWaste</w:t>
+                <w:sz w:val="24"/>
+                <w:szCs w:val="24"/>
+                <w:color w:val="000000"/>
+              </w:rPr>
+              <w:t xml:space="preserve">Annual landfill tonnes, before and after</w:t>
             </w:r>
           </w:p>
         </w:tc>
@@ -2434,10 +2704,10 @@
         <w:tc>
           <w:tcPr>
             <w:tcBorders>
-              <w:bottom w:val="single" w:sz="6" w:space="0" w:color="9AA8B8"/>
-              <w:top w:val="single" w:sz="6" w:space="0" w:color="9AA8B8"/>
-              <w:left w:val="none" w:sz="0" w:space="0" w:color="000000"/>
-              <w:right w:val="none" w:sz="0" w:space="0" w:color="000000"/>
+              <w:bottom w:val="single" w:sz="6" w:space="0" w:color="D9D9D9"/>
+              <w:top w:val="single" w:sz="6" w:space="0" w:color="D9D9D9"/>
+              <w:left w:val="single" w:sz="6" w:space="0" w:color="D9D9D9"/>
+              <w:right w:val="single" w:sz="6" w:space="0" w:color="D9D9D9"/>
             </w:tcBorders>
             <w:shd w:val="clear" w:color="auto" w:fill="FFFFFF"/>
             <w:tcMar>
@@ -2446,7 +2716,7 @@
               <w:left w:w="0" w:type="dxa"/>
               <w:right w:w="0" w:type="dxa"/>
             </w:tcMar>
-            <w:vAlign w:val="top"/>
+            <w:vAlign w:val="center"/>
           </w:tcPr>
           <w:p>
             <w:pPr>
@@ -2457,41 +2727,41 @@
                 <w:left w:val="none" w:sz="0" w:space="0" w:color="000000"/>
                 <w:right w:val="none" w:sz="0" w:space="0" w:color="000000"/>
               </w:pBdr>
-              <w:spacing w:after="80" w:before="80" w:line="240"/>
-              <w:ind w:left="80" w:right="80" w:firstLine="0" w:firstLineChars="0"/>
-              <w:rPr>
-                <w:rFonts w:ascii="Consolas" w:hAnsi="Consolas" w:eastAsia="Consolas" w:cs="Consolas"/>
-                <w:i w:val="false"/>
-                <w:b w:val="true"/>
-                <w:u w:val="none"/>
-                <w:strike w:val="false"/>
-                <w:sz w:val="20"/>
-                <w:szCs w:val="20"/>
+              <w:spacing w:after="140" w:before="140" w:line="240"/>
+              <w:ind w:left="140" w:right="140" w:firstLine="0" w:firstLineChars="0"/>
+              <w:rPr>
+                <w:rFonts w:ascii="Arial" w:hAnsi="Arial" w:eastAsia="Arial" w:cs="Arial"/>
+                <w:i w:val="false"/>
+                <w:b w:val="false"/>
+                <w:u w:val="none"/>
+                <w:strike w:val="false"/>
+                <w:sz w:val="24"/>
+                <w:szCs w:val="24"/>
                 <w:color w:val="000000"/>
               </w:rPr>
             </w:pPr>
             <w:r>
               <w:rPr>
-                <w:rFonts w:ascii="Consolas" w:hAnsi="Consolas" w:eastAsia="Consolas" w:cs="Consolas"/>
-                <w:i w:val="false"/>
-                <w:b w:val="true"/>
-                <w:u w:val="none"/>
-                <w:strike w:val="false"/>
-                <w:sz w:val="20"/>
-                <w:szCs w:val="20"/>
-                <w:color w:val="000000"/>
-              </w:rPr>
-              <w:t xml:space="preserve">cost_before, cost_after</w:t>
+                <w:rFonts w:ascii="Arial" w:hAnsi="Arial" w:eastAsia="Arial" w:cs="Arial"/>
+                <w:i w:val="false"/>
+                <w:b w:val="false"/>
+                <w:u w:val="none"/>
+                <w:strike w:val="false"/>
+                <w:sz w:val="24"/>
+                <w:szCs w:val="24"/>
+                <w:color w:val="000000"/>
+              </w:rPr>
+              <w:t xml:space="preserve">manager_age and staff</w:t>
             </w:r>
           </w:p>
         </w:tc>
         <w:tc>
           <w:tcPr>
             <w:tcBorders>
-              <w:bottom w:val="single" w:sz="6" w:space="0" w:color="9AA8B8"/>
-              <w:top w:val="single" w:sz="6" w:space="0" w:color="9AA8B8"/>
-              <w:left w:val="none" w:sz="0" w:space="0" w:color="000000"/>
-              <w:right w:val="none" w:sz="0" w:space="0" w:color="000000"/>
+              <w:bottom w:val="single" w:sz="6" w:space="0" w:color="D9D9D9"/>
+              <w:top w:val="single" w:sz="6" w:space="0" w:color="D9D9D9"/>
+              <w:left w:val="single" w:sz="6" w:space="0" w:color="D9D9D9"/>
+              <w:right w:val="single" w:sz="6" w:space="0" w:color="D9D9D9"/>
             </w:tcBorders>
             <w:shd w:val="clear" w:color="auto" w:fill="FFFFFF"/>
             <w:tcMar>
@@ -2500,7 +2770,7 @@
               <w:left w:w="0" w:type="dxa"/>
               <w:right w:w="0" w:type="dxa"/>
             </w:tcMar>
-            <w:vAlign w:val="top"/>
+            <w:vAlign w:val="center"/>
           </w:tcPr>
           <w:p>
             <w:pPr>
@@ -2511,16 +2781,16 @@
                 <w:left w:val="none" w:sz="0" w:space="0" w:color="000000"/>
                 <w:right w:val="none" w:sz="0" w:space="0" w:color="000000"/>
               </w:pBdr>
-              <w:spacing w:after="80" w:before="80" w:line="240"/>
-              <w:ind w:left="80" w:right="80" w:firstLine="0" w:firstLineChars="0"/>
-              <w:rPr>
-                <w:rFonts w:ascii="Arial" w:hAnsi="Arial" w:eastAsia="Arial" w:cs="Arial"/>
-                <w:i w:val="false"/>
-                <w:b w:val="false"/>
-                <w:u w:val="none"/>
-                <w:strike w:val="false"/>
-                <w:sz w:val="20"/>
-                <w:szCs w:val="20"/>
+              <w:spacing w:after="140" w:before="140" w:line="240"/>
+              <w:ind w:left="140" w:right="140" w:firstLine="0" w:firstLineChars="0"/>
+              <w:rPr>
+                <w:rFonts w:ascii="Arial" w:hAnsi="Arial" w:eastAsia="Arial" w:cs="Arial"/>
+                <w:i w:val="false"/>
+                <w:b w:val="false"/>
+                <w:u w:val="none"/>
+                <w:strike w:val="false"/>
+                <w:sz w:val="24"/>
+                <w:szCs w:val="24"/>
                 <w:color w:val="000000"/>
               </w:rPr>
             </w:pPr>
@@ -2531,11 +2801,11 @@
                 <w:b w:val="false"/>
                 <w:u w:val="none"/>
                 <w:strike w:val="false"/>
-                <w:sz w:val="20"/>
-                <w:szCs w:val="20"/>
-                <w:color w:val="000000"/>
-              </w:rPr>
-              <w:t xml:space="preserve">waste-management costs in AED, before and 12 months after</w:t>
+                <w:sz w:val="24"/>
+                <w:szCs w:val="24"/>
+                <w:color w:val="000000"/>
+              </w:rPr>
+              <w:t xml:space="preserve">Manager age in years; number of staff</w:t>
             </w:r>
           </w:p>
         </w:tc>
@@ -2548,19 +2818,19 @@
         <w:tc>
           <w:tcPr>
             <w:tcBorders>
-              <w:bottom w:val="single" w:sz="6" w:space="0" w:color="9AA8B8"/>
-              <w:top w:val="single" w:sz="6" w:space="0" w:color="9AA8B8"/>
-              <w:left w:val="none" w:sz="0" w:space="0" w:color="000000"/>
-              <w:right w:val="none" w:sz="0" w:space="0" w:color="000000"/>
+              <w:bottom w:val="single" w:sz="6" w:space="0" w:color="D9D9D9"/>
+              <w:top w:val="single" w:sz="6" w:space="0" w:color="D9D9D9"/>
+              <w:left w:val="single" w:sz="6" w:space="0" w:color="D9D9D9"/>
+              <w:right w:val="single" w:sz="6" w:space="0" w:color="D9D9D9"/>
             </w:tcBorders>
-            <w:shd w:val="clear" w:color="auto" w:fill="FFFFFF"/>
+            <w:shd w:val="clear" w:color="auto" w:fill="F1F5F9"/>
             <w:tcMar>
               <w:top w:w="0" w:type="dxa"/>
               <w:bottom w:w="0" w:type="dxa"/>
               <w:left w:w="0" w:type="dxa"/>
               <w:right w:w="0" w:type="dxa"/>
             </w:tcMar>
-            <w:vAlign w:val="top"/>
+            <w:vAlign w:val="center"/>
           </w:tcPr>
           <w:p>
             <w:pPr>
@@ -2571,50 +2841,50 @@
                 <w:left w:val="none" w:sz="0" w:space="0" w:color="000000"/>
                 <w:right w:val="none" w:sz="0" w:space="0" w:color="000000"/>
               </w:pBdr>
-              <w:spacing w:after="80" w:before="80" w:line="240"/>
-              <w:ind w:left="80" w:right="80" w:firstLine="0" w:firstLineChars="0"/>
-              <w:rPr>
-                <w:rFonts w:ascii="Consolas" w:hAnsi="Consolas" w:eastAsia="Consolas" w:cs="Consolas"/>
-                <w:i w:val="false"/>
-                <w:b w:val="true"/>
-                <w:u w:val="none"/>
-                <w:strike w:val="false"/>
-                <w:sz w:val="20"/>
-                <w:szCs w:val="20"/>
+              <w:spacing w:after="140" w:before="140" w:line="240"/>
+              <w:ind w:left="140" w:right="140" w:firstLine="0" w:firstLineChars="0"/>
+              <w:rPr>
+                <w:rFonts w:ascii="Arial" w:hAnsi="Arial" w:eastAsia="Arial" w:cs="Arial"/>
+                <w:i w:val="false"/>
+                <w:b w:val="false"/>
+                <w:u w:val="none"/>
+                <w:strike w:val="false"/>
+                <w:sz w:val="24"/>
+                <w:szCs w:val="24"/>
                 <w:color w:val="000000"/>
               </w:rPr>
             </w:pPr>
             <w:r>
               <w:rPr>
-                <w:rFonts w:ascii="Consolas" w:hAnsi="Consolas" w:eastAsia="Consolas" w:cs="Consolas"/>
-                <w:i w:val="false"/>
-                <w:b w:val="true"/>
-                <w:u w:val="none"/>
-                <w:strike w:val="false"/>
-                <w:sz w:val="20"/>
-                <w:szCs w:val="20"/>
-                <w:color w:val="000000"/>
-              </w:rPr>
-              <w:t xml:space="preserve">manager_age, staff, area, filtration</w:t>
+                <w:rFonts w:ascii="Arial" w:hAnsi="Arial" w:eastAsia="Arial" w:cs="Arial"/>
+                <w:i w:val="false"/>
+                <w:b w:val="false"/>
+                <w:u w:val="none"/>
+                <w:strike w:val="false"/>
+                <w:sz w:val="24"/>
+                <w:szCs w:val="24"/>
+                <w:color w:val="000000"/>
+              </w:rPr>
+              <w:t xml:space="preserve">area and filtration</w:t>
             </w:r>
           </w:p>
         </w:tc>
         <w:tc>
           <w:tcPr>
             <w:tcBorders>
-              <w:bottom w:val="single" w:sz="6" w:space="0" w:color="9AA8B8"/>
-              <w:top w:val="single" w:sz="6" w:space="0" w:color="9AA8B8"/>
-              <w:left w:val="none" w:sz="0" w:space="0" w:color="000000"/>
-              <w:right w:val="none" w:sz="0" w:space="0" w:color="000000"/>
+              <w:bottom w:val="single" w:sz="6" w:space="0" w:color="D9D9D9"/>
+              <w:top w:val="single" w:sz="6" w:space="0" w:color="D9D9D9"/>
+              <w:left w:val="single" w:sz="6" w:space="0" w:color="D9D9D9"/>
+              <w:right w:val="single" w:sz="6" w:space="0" w:color="D9D9D9"/>
             </w:tcBorders>
-            <w:shd w:val="clear" w:color="auto" w:fill="FFFFFF"/>
+            <w:shd w:val="clear" w:color="auto" w:fill="F1F5F9"/>
             <w:tcMar>
               <w:top w:w="0" w:type="dxa"/>
               <w:bottom w:w="0" w:type="dxa"/>
               <w:left w:w="0" w:type="dxa"/>
               <w:right w:w="0" w:type="dxa"/>
             </w:tcMar>
-            <w:vAlign w:val="top"/>
+            <w:vAlign w:val="center"/>
           </w:tcPr>
           <w:p>
             <w:pPr>
@@ -2625,16 +2895,16 @@
                 <w:left w:val="none" w:sz="0" w:space="0" w:color="000000"/>
                 <w:right w:val="none" w:sz="0" w:space="0" w:color="000000"/>
               </w:pBdr>
-              <w:spacing w:after="80" w:before="80" w:line="240"/>
-              <w:ind w:left="80" w:right="80" w:firstLine="0" w:firstLineChars="0"/>
-              <w:rPr>
-                <w:rFonts w:ascii="Arial" w:hAnsi="Arial" w:eastAsia="Arial" w:cs="Arial"/>
-                <w:i w:val="false"/>
-                <w:b w:val="false"/>
-                <w:u w:val="none"/>
-                <w:strike w:val="false"/>
-                <w:sz w:val="20"/>
-                <w:szCs w:val="20"/>
+              <w:spacing w:after="140" w:before="140" w:line="240"/>
+              <w:ind w:left="140" w:right="140" w:firstLine="0" w:firstLineChars="0"/>
+              <w:rPr>
+                <w:rFonts w:ascii="Arial" w:hAnsi="Arial" w:eastAsia="Arial" w:cs="Arial"/>
+                <w:i w:val="false"/>
+                <w:b w:val="false"/>
+                <w:u w:val="none"/>
+                <w:strike w:val="false"/>
+                <w:sz w:val="24"/>
+                <w:szCs w:val="24"/>
                 <w:color w:val="000000"/>
               </w:rPr>
             </w:pPr>
@@ -2645,19 +2915,46 @@
                 <w:b w:val="false"/>
                 <w:u w:val="none"/>
                 <w:strike w:val="false"/>
-                <w:sz w:val="20"/>
-                <w:szCs w:val="20"/>
-                <w:color w:val="000000"/>
-              </w:rPr>
-              <w:t xml:space="preserve">manager's age; number of staff; premises area (100 m2); 1 if advanced filtration was already installed</w:t>
+                <w:sz w:val="24"/>
+                <w:szCs w:val="24"/>
+                <w:color w:val="000000"/>
+              </w:rPr>
+              <w:t xml:space="preserve">Premises area in 100 square metres; 1 if advanced filtration was already installed</w:t>
             </w:r>
           </w:p>
         </w:tc>
       </w:tr>
     </w:tbl>
+    <w:p>
+      <w:pPr>
+        <w:pStyle w:val="Normal"/>
+        <w:jc w:val="left"/>
+        <w:pBdr>
+          <w:bottom w:val="none" w:sz="0" w:space="0" w:color="000000"/>
+          <w:top w:val="none" w:sz="0" w:space="0" w:color="000000"/>
+          <w:left w:val="none" w:sz="0" w:space="0" w:color="000000"/>
+          <w:right w:val="none" w:sz="0" w:space="0" w:color="000000"/>
+        </w:pBdr>
+        <w:spacing w:after="160" w:before="0" w:line="240"/>
+        <w:ind w:left="0" w:right="0" w:firstLine="0" w:firstLineChars="0"/>
+      </w:pPr>
+      <w:r>
+        <w:rPr>
+          <w:rFonts w:ascii="Arial" w:hAnsi="Arial" w:eastAsia="Arial" w:cs="Arial"/>
+          <w:i w:val="false"/>
+          <w:b w:val="false"/>
+          <w:u w:val="none"/>
+          <w:strike w:val="false"/>
+          <w:sz w:val="18"/>
+          <w:szCs w:val="18"/>
+          <w:color w:val="545860"/>
+        </w:rPr>
+        <w:t xml:space="preserve">Fictional GreenWaste case | invented figures</w:t>
+      </w:r>
+    </w:p>
     <w:sectPr>
-      <w:pgMar w:header="708" w:bottom="864" w:top="864" w:right="1080" w:left="1080" w:footer="708" w:gutter="0"/>
-      <w:pgSz w:h="16838" w:w="11906" w:orient="portrait"/>
+      <w:pgMar w:header="708" w:bottom="936" w:top="936" w:right="1008" w:left="1008" w:footer="708" w:gutter="0"/>
+      <w:pgSz w:h="16834" w:w="11909" w:orient="portrait"/>
       <w:type w:val="continuous"/>
       <w:cols/>
     </w:sectPr>
@@ -3764,6 +4061,16 @@
     <w:next w:val="Normal"/>
     <w:rsid w:val="00901463"/>
   </w:style>
+  <w:style w:type="paragraph" w:styleId="Title">
+    <w:name w:val="Title"/>
+    <w:basedOn w:val="Normal"/>
+    <w:next w:val="Normal"/>
+    <w:qFormat/>
+    <w:rPr>
+      <w:color w:val="000000"/>
+      <w:sz w:val="44"/>
+    </w:rPr>
+  </w:style>
 </w:styles>
 </file>
 

</xml_diff>